<commit_message>
Add UI flow, API routes with model escalation, verified rules; update PRD
</commit_message>
<xml_diff>
--- a/PRD - Hospital Bill Navigator.docx
+++ b/PRD - Hospital Bill Navigator.docx
@@ -430,7 +430,7 @@
         <w:spacing w:after="100"/>
       </w:pPr>
       <w:r>
-        <w:t xml:space="preserve">Households paid PHP 615.16 billion out of pocket for health in 2024, 42.7% of current health expenditure (PSA, Philippine National Health Accounts). About 1.2 million households faced catastrophic health spending in 2023. These figures come from news coverage and must be re-verified before external use.</w:t>
+        <w:t xml:space="preserve">Households paid PHP 615.16 billion out of pocket for health in 2024, 42.7% of current health expenditure (PSA Philippine National Health Accounts, confirmed). About 1.2 million households faced catastrophic health spending in 2023 (PIDS; PSA confirmation not found, so quote the count only).</w:t>
       </w:r>
     </w:p>
     <w:p>
@@ -438,7 +438,7 @@
         <w:spacing w:after="100"/>
       </w:pPr>
       <w:r>
-        <w:t xml:space="preserve">In 2026 the rules changed. Politician guarantee letters are banned, MAIFIP was funded at PHP 51.6B, and Zero Balance Billing (ZBB) covers ward stays in DOH-run hospitals. Private rooms, private hospitals and outpatient care (dialysis, chemo) remain gaps. Families do not know which side of the line they are on, and the old advice is outdated. Only static explainer articles exist; no personalized tool was found (search not exhaustive).</w:t>
+        <w:t xml:space="preserve">In 2026 the rules changed. The 2026 budget (RA 12314) bars political officials from influencing aid distribution, so politician guarantee letters are no longer the route. DOH's 18 Sep 2026 order on Zero Balance Billing (ZBB) now covers DOH hospitals and the four GOCC specialty hospitals (Heart Center, Lung Center, NKTI, PCMC); earlier guidance limits ZBB to ward/basic accommodation. MAIFIP is reported at PHP 51.6B for 2026 (news; not yet matched to the GAA line item). Private rooms, private hospitals and outpatient care (dialysis, chemo) remain gaps. Families do not know which side of the line they are on, and the old advice is outdated. No documented tool both reads a photographed bill and computes cross-program eligibility (market-gap claim unverified; search not exhaustive).</w:t>
       </w:r>
     </w:p>
     <w:p>
@@ -938,7 +938,31 @@
         </w:numPr>
       </w:pPr>
       <w:r>
-        <w:t xml:space="preserve">Platform: prioritize OpenAI models and the Responses API; model names and API shapes are taken from current official docs, not memory.</w:t>
+        <w:t xml:space="preserve">Platform: prioritize OpenAI models and the Responses API; model names and API shapes are taken from current official docs (checked 25 Oct 2026), not memory.</w:t>
+      </w:r>
+    </w:p>
+    <w:p>
+      <w:pPr>
+        <w:pStyle w:val="ListParagraph"/>
+        <w:numPr>
+          <w:ilvl w:val="0"/>
+          <w:numId w:val="2"/>
+        </w:numPr>
+      </w:pPr>
+      <w:r>
+        <w:t xml:space="preserve">DSWD AICS: amounts above PHP 5,000 are generally paid by guarantee letter or other non-cash instrument; published maximum PHP 75,000 in extremely justified cases, subject to assessment, funds and approval.</w:t>
+      </w:r>
+    </w:p>
+    <w:p>
+      <w:pPr>
+        <w:pStyle w:val="ListParagraph"/>
+        <w:numPr>
+          <w:ilvl w:val="0"/>
+          <w:numId w:val="2"/>
+        </w:numPr>
+      </w:pPr>
+      <w:r>
+        <w:t xml:space="preserve">Aid is not additive by default: funds cannot double-pay the same bill portion, and the order across programs is not a confirmed national rule. The app shows ranges and ordered steps, not guaranteed sums.</w:t>
       </w:r>
     </w:p>
     <w:p>
@@ -2515,7 +2539,7 @@
                 <w:sz w:val="20"/>
                 <w:szCs w:val="20"/>
               </w:rPr>
-              <w:t xml:space="preserve">The system shall extract line items (category, description, quantity, amount), deductions, totals and hospital name from the image into a structured schema using an OpenAI vision model.</w:t>
+              <w:t xml:space="preserve">The system shall extract line items (category, description, quantity, amount), deductions, totals and hospital name from the image using GPT-6.1 Sol via the OpenAI Responses API with a strict JSON Schema (Structured Outputs), returning null for unreadable amounts and never inferring them.</w:t>
             </w:r>
           </w:p>
         </w:tc>
@@ -2632,7 +2656,7 @@
                 <w:sz w:val="20"/>
                 <w:szCs w:val="20"/>
               </w:rPr>
-              <w:t xml:space="preserve">The system shall mark each extracted field with a confidence flag and let the user edit any value before continuing.</w:t>
+              <w:t xml:space="preserve">The system shall mark each unreadable or null field as low confidence, let the user edit any value before continuing, and re-read the image once with GPT-6 Astra when three or more fields are low confidence or lines do not sum to the stated total.</w:t>
             </w:r>
           </w:p>
         </w:tc>
@@ -2749,7 +2773,7 @@
                 <w:sz w:val="20"/>
                 <w:szCs w:val="20"/>
               </w:rPr>
-              <w:t xml:space="preserve">The system shall generate a plain-language explanation of each line item in English and Taglish, switchable by a toggle.</w:t>
+              <w:t xml:space="preserve">The system shall generate a plain-language explanation of each line item in English and Taglish using GPT-6 Luna with strict structured output, switchable by a toggle, and fall back to cached or blank explanations if the call fails.</w:t>
             </w:r>
           </w:p>
         </w:tc>
@@ -4153,7 +4177,7 @@
                 <w:sz w:val="20"/>
                 <w:szCs w:val="20"/>
               </w:rPr>
-              <w:t xml:space="preserve">The system shall store checklist progress in the browser only and shall not send personal data to any server beyond the extraction call.</w:t>
+              <w:t xml:space="preserve">The system shall store checklist progress in the browser only and shall not send personal data to any server beyond the extraction and explanation calls.</w:t>
             </w:r>
           </w:p>
         </w:tc>
@@ -4210,6 +4234,357 @@
                 <w:szCs w:val="20"/>
               </w:rPr>
               <w:t xml:space="preserve">US1.12</w:t>
+            </w:r>
+          </w:p>
+        </w:tc>
+      </w:tr>
+      <w:tr>
+        <w:trPr>
+          <w:tblHeader w:val="off"/>
+        </w:trPr>
+        <w:tc>
+          <w:tcPr>
+            <w:tcW w:type="dxa" w:w="900"/>
+            <w:tcBorders>
+              <w:top w:val="single" w:color="BBBBBB" w:sz="1"/>
+              <w:left w:val="single" w:color="BBBBBB" w:sz="1"/>
+              <w:bottom w:val="single" w:color="BBBBBB" w:sz="1"/>
+              <w:right w:val="single" w:color="BBBBBB" w:sz="1"/>
+            </w:tcBorders>
+            <w:tcMar>
+              <w:top w:type="dxa" w:w="60"/>
+              <w:left w:type="dxa" w:w="100"/>
+              <w:bottom w:type="dxa" w:w="60"/>
+              <w:right w:type="dxa" w:w="100"/>
+            </w:tcMar>
+          </w:tcPr>
+          <w:p>
+            <w:r>
+              <w:rPr>
+                <w:b w:val="false"/>
+                <w:bCs w:val="false"/>
+                <w:sz w:val="20"/>
+                <w:szCs w:val="20"/>
+              </w:rPr>
+              <w:t xml:space="preserve">FR01.17</w:t>
+            </w:r>
+          </w:p>
+        </w:tc>
+        <w:tc>
+          <w:tcPr>
+            <w:tcW w:type="dxa" w:w="5460"/>
+            <w:tcBorders>
+              <w:top w:val="single" w:color="BBBBBB" w:sz="1"/>
+              <w:left w:val="single" w:color="BBBBBB" w:sz="1"/>
+              <w:bottom w:val="single" w:color="BBBBBB" w:sz="1"/>
+              <w:right w:val="single" w:color="BBBBBB" w:sz="1"/>
+            </w:tcBorders>
+            <w:tcMar>
+              <w:top w:type="dxa" w:w="60"/>
+              <w:left w:type="dxa" w:w="100"/>
+              <w:bottom w:type="dxa" w:w="60"/>
+              <w:right w:type="dxa" w:w="100"/>
+            </w:tcMar>
+          </w:tcPr>
+          <w:p>
+            <w:r>
+              <w:rPr>
+                <w:b w:val="false"/>
+                <w:bCs w:val="false"/>
+                <w:sz w:val="20"/>
+                <w:szCs w:val="20"/>
+              </w:rPr>
+              <w:t xml:space="preserve">The system shall call OpenAI with store set to false, resize photos to at most 2200 px before upload, cap output tokens per call, and make no more than one escalation retry per bill.</w:t>
+            </w:r>
+          </w:p>
+        </w:tc>
+        <w:tc>
+          <w:tcPr>
+            <w:tcW w:type="dxa" w:w="1200"/>
+            <w:tcBorders>
+              <w:top w:val="single" w:color="BBBBBB" w:sz="1"/>
+              <w:left w:val="single" w:color="BBBBBB" w:sz="1"/>
+              <w:bottom w:val="single" w:color="BBBBBB" w:sz="1"/>
+              <w:right w:val="single" w:color="BBBBBB" w:sz="1"/>
+            </w:tcBorders>
+            <w:tcMar>
+              <w:top w:type="dxa" w:w="60"/>
+              <w:left w:type="dxa" w:w="100"/>
+              <w:bottom w:type="dxa" w:w="60"/>
+              <w:right w:type="dxa" w:w="100"/>
+            </w:tcMar>
+          </w:tcPr>
+          <w:p>
+            <w:r>
+              <w:rPr>
+                <w:b w:val="false"/>
+                <w:bCs w:val="false"/>
+                <w:sz w:val="20"/>
+                <w:szCs w:val="20"/>
+              </w:rPr>
+              <w:t xml:space="preserve">M</w:t>
+            </w:r>
+          </w:p>
+        </w:tc>
+        <w:tc>
+          <w:tcPr>
+            <w:tcW w:type="dxa" w:w="1800"/>
+            <w:tcBorders>
+              <w:top w:val="single" w:color="BBBBBB" w:sz="1"/>
+              <w:left w:val="single" w:color="BBBBBB" w:sz="1"/>
+              <w:bottom w:val="single" w:color="BBBBBB" w:sz="1"/>
+              <w:right w:val="single" w:color="BBBBBB" w:sz="1"/>
+            </w:tcBorders>
+            <w:tcMar>
+              <w:top w:type="dxa" w:w="60"/>
+              <w:left w:type="dxa" w:w="100"/>
+              <w:bottom w:type="dxa" w:w="60"/>
+              <w:right w:type="dxa" w:w="100"/>
+            </w:tcMar>
+          </w:tcPr>
+          <w:p>
+            <w:r>
+              <w:rPr>
+                <w:b w:val="false"/>
+                <w:bCs w:val="false"/>
+                <w:sz w:val="20"/>
+                <w:szCs w:val="20"/>
+              </w:rPr>
+              <w:t xml:space="preserve">US1.1</w:t>
+            </w:r>
+          </w:p>
+        </w:tc>
+      </w:tr>
+      <w:tr>
+        <w:trPr>
+          <w:tblHeader w:val="off"/>
+        </w:trPr>
+        <w:tc>
+          <w:tcPr>
+            <w:tcW w:type="dxa" w:w="900"/>
+            <w:tcBorders>
+              <w:top w:val="single" w:color="BBBBBB" w:sz="1"/>
+              <w:left w:val="single" w:color="BBBBBB" w:sz="1"/>
+              <w:bottom w:val="single" w:color="BBBBBB" w:sz="1"/>
+              <w:right w:val="single" w:color="BBBBBB" w:sz="1"/>
+            </w:tcBorders>
+            <w:tcMar>
+              <w:top w:type="dxa" w:w="60"/>
+              <w:left w:type="dxa" w:w="100"/>
+              <w:bottom w:type="dxa" w:w="60"/>
+              <w:right w:type="dxa" w:w="100"/>
+            </w:tcMar>
+          </w:tcPr>
+          <w:p>
+            <w:r>
+              <w:rPr>
+                <w:b w:val="false"/>
+                <w:bCs w:val="false"/>
+                <w:sz w:val="20"/>
+                <w:szCs w:val="20"/>
+              </w:rPr>
+              <w:t xml:space="preserve">FR01.18</w:t>
+            </w:r>
+          </w:p>
+        </w:tc>
+        <w:tc>
+          <w:tcPr>
+            <w:tcW w:type="dxa" w:w="5460"/>
+            <w:tcBorders>
+              <w:top w:val="single" w:color="BBBBBB" w:sz="1"/>
+              <w:left w:val="single" w:color="BBBBBB" w:sz="1"/>
+              <w:bottom w:val="single" w:color="BBBBBB" w:sz="1"/>
+              <w:right w:val="single" w:color="BBBBBB" w:sz="1"/>
+            </w:tcBorders>
+            <w:tcMar>
+              <w:top w:type="dxa" w:w="60"/>
+              <w:left w:type="dxa" w:w="100"/>
+              <w:bottom w:type="dxa" w:w="60"/>
+              <w:right w:type="dxa" w:w="100"/>
+            </w:tcMar>
+          </w:tcPr>
+          <w:p>
+            <w:r>
+              <w:rPr>
+                <w:b w:val="false"/>
+                <w:bCs w:val="false"/>
+                <w:sz w:val="20"/>
+                <w:szCs w:val="20"/>
+              </w:rPr>
+              <w:t xml:space="preserve">The rules engine shall apply Senior Citizen and PWD 20% discounts before aid, and shall not apply a blanket discount for minors or pregnant patients.</w:t>
+            </w:r>
+          </w:p>
+        </w:tc>
+        <w:tc>
+          <w:tcPr>
+            <w:tcW w:type="dxa" w:w="1200"/>
+            <w:tcBorders>
+              <w:top w:val="single" w:color="BBBBBB" w:sz="1"/>
+              <w:left w:val="single" w:color="BBBBBB" w:sz="1"/>
+              <w:bottom w:val="single" w:color="BBBBBB" w:sz="1"/>
+              <w:right w:val="single" w:color="BBBBBB" w:sz="1"/>
+            </w:tcBorders>
+            <w:tcMar>
+              <w:top w:type="dxa" w:w="60"/>
+              <w:left w:type="dxa" w:w="100"/>
+              <w:bottom w:type="dxa" w:w="60"/>
+              <w:right w:type="dxa" w:w="100"/>
+            </w:tcMar>
+          </w:tcPr>
+          <w:p>
+            <w:r>
+              <w:rPr>
+                <w:b w:val="false"/>
+                <w:bCs w:val="false"/>
+                <w:sz w:val="20"/>
+                <w:szCs w:val="20"/>
+              </w:rPr>
+              <w:t xml:space="preserve">M</w:t>
+            </w:r>
+          </w:p>
+        </w:tc>
+        <w:tc>
+          <w:tcPr>
+            <w:tcW w:type="dxa" w:w="1800"/>
+            <w:tcBorders>
+              <w:top w:val="single" w:color="BBBBBB" w:sz="1"/>
+              <w:left w:val="single" w:color="BBBBBB" w:sz="1"/>
+              <w:bottom w:val="single" w:color="BBBBBB" w:sz="1"/>
+              <w:right w:val="single" w:color="BBBBBB" w:sz="1"/>
+            </w:tcBorders>
+            <w:tcMar>
+              <w:top w:type="dxa" w:w="60"/>
+              <w:left w:type="dxa" w:w="100"/>
+              <w:bottom w:type="dxa" w:w="60"/>
+              <w:right w:type="dxa" w:w="100"/>
+            </w:tcMar>
+          </w:tcPr>
+          <w:p>
+            <w:r>
+              <w:rPr>
+                <w:b w:val="false"/>
+                <w:bCs w:val="false"/>
+                <w:sz w:val="20"/>
+                <w:szCs w:val="20"/>
+              </w:rPr>
+              <w:t xml:space="preserve">US1.4</w:t>
+            </w:r>
+          </w:p>
+        </w:tc>
+      </w:tr>
+      <w:tr>
+        <w:trPr>
+          <w:tblHeader w:val="off"/>
+        </w:trPr>
+        <w:tc>
+          <w:tcPr>
+            <w:tcW w:type="dxa" w:w="900"/>
+            <w:tcBorders>
+              <w:top w:val="single" w:color="BBBBBB" w:sz="1"/>
+              <w:left w:val="single" w:color="BBBBBB" w:sz="1"/>
+              <w:bottom w:val="single" w:color="BBBBBB" w:sz="1"/>
+              <w:right w:val="single" w:color="BBBBBB" w:sz="1"/>
+            </w:tcBorders>
+            <w:tcMar>
+              <w:top w:type="dxa" w:w="60"/>
+              <w:left w:type="dxa" w:w="100"/>
+              <w:bottom w:type="dxa" w:w="60"/>
+              <w:right w:type="dxa" w:w="100"/>
+            </w:tcMar>
+          </w:tcPr>
+          <w:p>
+            <w:r>
+              <w:rPr>
+                <w:b w:val="false"/>
+                <w:bCs w:val="false"/>
+                <w:sz w:val="20"/>
+                <w:szCs w:val="20"/>
+              </w:rPr>
+              <w:t xml:space="preserve">FR01.19</w:t>
+            </w:r>
+          </w:p>
+        </w:tc>
+        <w:tc>
+          <w:tcPr>
+            <w:tcW w:type="dxa" w:w="5460"/>
+            <w:tcBorders>
+              <w:top w:val="single" w:color="BBBBBB" w:sz="1"/>
+              <w:left w:val="single" w:color="BBBBBB" w:sz="1"/>
+              <w:bottom w:val="single" w:color="BBBBBB" w:sz="1"/>
+              <w:right w:val="single" w:color="BBBBBB" w:sz="1"/>
+            </w:tcBorders>
+            <w:tcMar>
+              <w:top w:type="dxa" w:w="60"/>
+              <w:left w:type="dxa" w:w="100"/>
+              <w:bottom w:type="dxa" w:w="60"/>
+              <w:right w:type="dxa" w:w="100"/>
+            </w:tcMar>
+          </w:tcPr>
+          <w:p>
+            <w:r>
+              <w:rPr>
+                <w:b w:val="false"/>
+                <w:bCs w:val="false"/>
+                <w:sz w:val="20"/>
+                <w:szCs w:val="20"/>
+              </w:rPr>
+              <w:t xml:space="preserve">The system shall show, per program, the open caveat (what is unverified) next to the source link and last-checked date.</w:t>
+            </w:r>
+          </w:p>
+        </w:tc>
+        <w:tc>
+          <w:tcPr>
+            <w:tcW w:type="dxa" w:w="1200"/>
+            <w:tcBorders>
+              <w:top w:val="single" w:color="BBBBBB" w:sz="1"/>
+              <w:left w:val="single" w:color="BBBBBB" w:sz="1"/>
+              <w:bottom w:val="single" w:color="BBBBBB" w:sz="1"/>
+              <w:right w:val="single" w:color="BBBBBB" w:sz="1"/>
+            </w:tcBorders>
+            <w:tcMar>
+              <w:top w:type="dxa" w:w="60"/>
+              <w:left w:type="dxa" w:w="100"/>
+              <w:bottom w:type="dxa" w:w="60"/>
+              <w:right w:type="dxa" w:w="100"/>
+            </w:tcMar>
+          </w:tcPr>
+          <w:p>
+            <w:r>
+              <w:rPr>
+                <w:b w:val="false"/>
+                <w:bCs w:val="false"/>
+                <w:sz w:val="20"/>
+                <w:szCs w:val="20"/>
+              </w:rPr>
+              <w:t xml:space="preserve">M</w:t>
+            </w:r>
+          </w:p>
+        </w:tc>
+        <w:tc>
+          <w:tcPr>
+            <w:tcW w:type="dxa" w:w="1800"/>
+            <w:tcBorders>
+              <w:top w:val="single" w:color="BBBBBB" w:sz="1"/>
+              <w:left w:val="single" w:color="BBBBBB" w:sz="1"/>
+              <w:bottom w:val="single" w:color="BBBBBB" w:sz="1"/>
+              <w:right w:val="single" w:color="BBBBBB" w:sz="1"/>
+            </w:tcBorders>
+            <w:tcMar>
+              <w:top w:type="dxa" w:w="60"/>
+              <w:left w:type="dxa" w:w="100"/>
+              <w:bottom w:type="dxa" w:w="60"/>
+              <w:right w:type="dxa" w:w="100"/>
+            </w:tcMar>
+          </w:tcPr>
+          <w:p>
+            <w:r>
+              <w:rPr>
+                <w:b w:val="false"/>
+                <w:bCs w:val="false"/>
+                <w:sz w:val="20"/>
+                <w:szCs w:val="20"/>
+              </w:rPr>
+              <w:t xml:space="preserve">US1.8</w:t>
             </w:r>
           </w:p>
         </w:tc>
@@ -4744,7 +5119,7 @@
                 <w:sz w:val="20"/>
                 <w:szCs w:val="20"/>
               </w:rPr>
-              <w:t xml:space="preserve">Total AI spend shall stay within the USD 50 credit by capping output tokens per call and caching repeat results.</w:t>
+              <w:t xml:space="preserve">Total AI spend shall stay within the USD 50 credit by using GPT-6 Luna ($0.10/$0.50 per M tokens) for text, GPT-6.1 Sol ($2/$10) for extraction, GPT-6 Astra ($10/$50) only on escalation, capping output at 2,500 tokens for extraction, and caching explanations for the sample.</w:t>
             </w:r>
           </w:p>
         </w:tc>
@@ -5279,7 +5654,760 @@
         <w:pStyle w:val="Heading1"/>
       </w:pPr>
       <w:r>
-        <w:t xml:space="preserve">8. Open Questions &amp; Risks</w:t>
+        <w:t xml:space="preserve">8. OpenAI Features Applied</w:t>
+      </w:r>
+    </w:p>
+    <w:tbl>
+      <w:tblPr>
+        <w:tblW w:type="auto" w:w="100"/>
+        <w:tblBorders>
+          <w:top w:val="single" w:color="auto" w:sz="4"/>
+          <w:left w:val="single" w:color="auto" w:sz="4"/>
+          <w:bottom w:val="single" w:color="auto" w:sz="4"/>
+          <w:right w:val="single" w:color="auto" w:sz="4"/>
+          <w:insideH w:val="single" w:color="auto" w:sz="4"/>
+          <w:insideV w:val="single" w:color="auto" w:sz="4"/>
+        </w:tblBorders>
+      </w:tblPr>
+      <w:tblGrid>
+        <w:gridCol w:w="2600"/>
+        <w:gridCol w:w="3400"/>
+        <w:gridCol w:w="3360"/>
+      </w:tblGrid>
+      <w:tr>
+        <w:trPr>
+          <w:tblHeader/>
+        </w:trPr>
+        <w:tc>
+          <w:tcPr>
+            <w:tcW w:type="dxa" w:w="2600"/>
+            <w:tcBorders>
+              <w:top w:val="single" w:color="BBBBBB" w:sz="1"/>
+              <w:left w:val="single" w:color="BBBBBB" w:sz="1"/>
+              <w:bottom w:val="single" w:color="BBBBBB" w:sz="1"/>
+              <w:right w:val="single" w:color="BBBBBB" w:sz="1"/>
+            </w:tcBorders>
+            <w:shd w:fill="E7E6E6" w:val="clear"/>
+            <w:tcMar>
+              <w:top w:type="dxa" w:w="60"/>
+              <w:left w:type="dxa" w:w="100"/>
+              <w:bottom w:type="dxa" w:w="60"/>
+              <w:right w:type="dxa" w:w="100"/>
+            </w:tcMar>
+          </w:tcPr>
+          <w:p>
+            <w:r>
+              <w:rPr>
+                <w:b/>
+                <w:bCs/>
+                <w:sz w:val="20"/>
+                <w:szCs w:val="20"/>
+              </w:rPr>
+              <w:t xml:space="preserve">Feature</w:t>
+            </w:r>
+          </w:p>
+        </w:tc>
+        <w:tc>
+          <w:tcPr>
+            <w:tcW w:type="dxa" w:w="3400"/>
+            <w:tcBorders>
+              <w:top w:val="single" w:color="BBBBBB" w:sz="1"/>
+              <w:left w:val="single" w:color="BBBBBB" w:sz="1"/>
+              <w:bottom w:val="single" w:color="BBBBBB" w:sz="1"/>
+              <w:right w:val="single" w:color="BBBBBB" w:sz="1"/>
+            </w:tcBorders>
+            <w:shd w:fill="E7E6E6" w:val="clear"/>
+            <w:tcMar>
+              <w:top w:type="dxa" w:w="60"/>
+              <w:left w:type="dxa" w:w="100"/>
+              <w:bottom w:type="dxa" w:w="60"/>
+              <w:right w:type="dxa" w:w="100"/>
+            </w:tcMar>
+          </w:tcPr>
+          <w:p>
+            <w:r>
+              <w:rPr>
+                <w:b/>
+                <w:bCs/>
+                <w:sz w:val="20"/>
+                <w:szCs w:val="20"/>
+              </w:rPr>
+              <w:t xml:space="preserve">Where it is used</w:t>
+            </w:r>
+          </w:p>
+        </w:tc>
+        <w:tc>
+          <w:tcPr>
+            <w:tcW w:type="dxa" w:w="3360"/>
+            <w:tcBorders>
+              <w:top w:val="single" w:color="BBBBBB" w:sz="1"/>
+              <w:left w:val="single" w:color="BBBBBB" w:sz="1"/>
+              <w:bottom w:val="single" w:color="BBBBBB" w:sz="1"/>
+              <w:right w:val="single" w:color="BBBBBB" w:sz="1"/>
+            </w:tcBorders>
+            <w:shd w:fill="E7E6E6" w:val="clear"/>
+            <w:tcMar>
+              <w:top w:type="dxa" w:w="60"/>
+              <w:left w:type="dxa" w:w="100"/>
+              <w:bottom w:type="dxa" w:w="60"/>
+              <w:right w:type="dxa" w:w="100"/>
+            </w:tcMar>
+          </w:tcPr>
+          <w:p>
+            <w:r>
+              <w:rPr>
+                <w:b/>
+                <w:bCs/>
+                <w:sz w:val="20"/>
+                <w:szCs w:val="20"/>
+              </w:rPr>
+              <w:t xml:space="preserve">Why</w:t>
+            </w:r>
+          </w:p>
+        </w:tc>
+      </w:tr>
+      <w:tr>
+        <w:trPr>
+          <w:tblHeader w:val="off"/>
+        </w:trPr>
+        <w:tc>
+          <w:tcPr>
+            <w:tcW w:type="dxa" w:w="2600"/>
+            <w:tcBorders>
+              <w:top w:val="single" w:color="BBBBBB" w:sz="1"/>
+              <w:left w:val="single" w:color="BBBBBB" w:sz="1"/>
+              <w:bottom w:val="single" w:color="BBBBBB" w:sz="1"/>
+              <w:right w:val="single" w:color="BBBBBB" w:sz="1"/>
+            </w:tcBorders>
+            <w:tcMar>
+              <w:top w:type="dxa" w:w="60"/>
+              <w:left w:type="dxa" w:w="100"/>
+              <w:bottom w:type="dxa" w:w="60"/>
+              <w:right w:type="dxa" w:w="100"/>
+            </w:tcMar>
+          </w:tcPr>
+          <w:p>
+            <w:r>
+              <w:rPr>
+                <w:b w:val="false"/>
+                <w:bCs w:val="false"/>
+                <w:sz w:val="20"/>
+                <w:szCs w:val="20"/>
+              </w:rPr>
+              <w:t xml:space="preserve">GPT-6.1 Sol (vision) via Responses API</w:t>
+            </w:r>
+          </w:p>
+        </w:tc>
+        <w:tc>
+          <w:tcPr>
+            <w:tcW w:type="dxa" w:w="3400"/>
+            <w:tcBorders>
+              <w:top w:val="single" w:color="BBBBBB" w:sz="1"/>
+              <w:left w:val="single" w:color="BBBBBB" w:sz="1"/>
+              <w:bottom w:val="single" w:color="BBBBBB" w:sz="1"/>
+              <w:right w:val="single" w:color="BBBBBB" w:sz="1"/>
+            </w:tcBorders>
+            <w:tcMar>
+              <w:top w:type="dxa" w:w="60"/>
+              <w:left w:type="dxa" w:w="100"/>
+              <w:bottom w:type="dxa" w:w="60"/>
+              <w:right w:type="dxa" w:w="100"/>
+            </w:tcMar>
+          </w:tcPr>
+          <w:p>
+            <w:r>
+              <w:rPr>
+                <w:b w:val="false"/>
+                <w:bCs w:val="false"/>
+                <w:sz w:val="20"/>
+                <w:szCs w:val="20"/>
+              </w:rPr>
+              <w:t xml:space="preserve">Reads the photographed SOA into line items (/api/extract)</w:t>
+            </w:r>
+          </w:p>
+        </w:tc>
+        <w:tc>
+          <w:tcPr>
+            <w:tcW w:type="dxa" w:w="3360"/>
+            <w:tcBorders>
+              <w:top w:val="single" w:color="BBBBBB" w:sz="1"/>
+              <w:left w:val="single" w:color="BBBBBB" w:sz="1"/>
+              <w:bottom w:val="single" w:color="BBBBBB" w:sz="1"/>
+              <w:right w:val="single" w:color="BBBBBB" w:sz="1"/>
+            </w:tcBorders>
+            <w:tcMar>
+              <w:top w:type="dxa" w:w="60"/>
+              <w:left w:type="dxa" w:w="100"/>
+              <w:bottom w:type="dxa" w:w="60"/>
+              <w:right w:type="dxa" w:w="100"/>
+            </w:tcMar>
+          </w:tcPr>
+          <w:p>
+            <w:r>
+              <w:rPr>
+                <w:b w:val="false"/>
+                <w:bCs w:val="false"/>
+                <w:sz w:val="20"/>
+                <w:szCs w:val="20"/>
+              </w:rPr>
+              <w:t xml:space="preserve">Balance of accuracy and cost ($2/$10 per M tokens); image input with detail 'original' for small print</w:t>
+            </w:r>
+          </w:p>
+        </w:tc>
+      </w:tr>
+      <w:tr>
+        <w:trPr>
+          <w:tblHeader w:val="off"/>
+        </w:trPr>
+        <w:tc>
+          <w:tcPr>
+            <w:tcW w:type="dxa" w:w="2600"/>
+            <w:tcBorders>
+              <w:top w:val="single" w:color="BBBBBB" w:sz="1"/>
+              <w:left w:val="single" w:color="BBBBBB" w:sz="1"/>
+              <w:bottom w:val="single" w:color="BBBBBB" w:sz="1"/>
+              <w:right w:val="single" w:color="BBBBBB" w:sz="1"/>
+            </w:tcBorders>
+            <w:tcMar>
+              <w:top w:type="dxa" w:w="60"/>
+              <w:left w:type="dxa" w:w="100"/>
+              <w:bottom w:type="dxa" w:w="60"/>
+              <w:right w:type="dxa" w:w="100"/>
+            </w:tcMar>
+          </w:tcPr>
+          <w:p>
+            <w:r>
+              <w:rPr>
+                <w:b w:val="false"/>
+                <w:bCs w:val="false"/>
+                <w:sz w:val="20"/>
+                <w:szCs w:val="20"/>
+              </w:rPr>
+              <w:t xml:space="preserve">Structured Outputs (strict JSON Schema)</w:t>
+            </w:r>
+          </w:p>
+        </w:tc>
+        <w:tc>
+          <w:tcPr>
+            <w:tcW w:type="dxa" w:w="3400"/>
+            <w:tcBorders>
+              <w:top w:val="single" w:color="BBBBBB" w:sz="1"/>
+              <w:left w:val="single" w:color="BBBBBB" w:sz="1"/>
+              <w:bottom w:val="single" w:color="BBBBBB" w:sz="1"/>
+              <w:right w:val="single" w:color="BBBBBB" w:sz="1"/>
+            </w:tcBorders>
+            <w:tcMar>
+              <w:top w:type="dxa" w:w="60"/>
+              <w:left w:type="dxa" w:w="100"/>
+              <w:bottom w:type="dxa" w:w="60"/>
+              <w:right w:type="dxa" w:w="100"/>
+            </w:tcMar>
+          </w:tcPr>
+          <w:p>
+            <w:r>
+              <w:rPr>
+                <w:b w:val="false"/>
+                <w:bCs w:val="false"/>
+                <w:sz w:val="20"/>
+                <w:szCs w:val="20"/>
+              </w:rPr>
+              <w:t xml:space="preserve">Extraction and explanation responses</w:t>
+            </w:r>
+          </w:p>
+        </w:tc>
+        <w:tc>
+          <w:tcPr>
+            <w:tcW w:type="dxa" w:w="3360"/>
+            <w:tcBorders>
+              <w:top w:val="single" w:color="BBBBBB" w:sz="1"/>
+              <w:left w:val="single" w:color="BBBBBB" w:sz="1"/>
+              <w:bottom w:val="single" w:color="BBBBBB" w:sz="1"/>
+              <w:right w:val="single" w:color="BBBBBB" w:sz="1"/>
+            </w:tcBorders>
+            <w:tcMar>
+              <w:top w:type="dxa" w:w="60"/>
+              <w:left w:type="dxa" w:w="100"/>
+              <w:bottom w:type="dxa" w:w="60"/>
+              <w:right w:type="dxa" w:w="100"/>
+            </w:tcMar>
+          </w:tcPr>
+          <w:p>
+            <w:r>
+              <w:rPr>
+                <w:b w:val="false"/>
+                <w:bCs w:val="false"/>
+                <w:sz w:val="20"/>
+                <w:szCs w:val="20"/>
+              </w:rPr>
+              <w:t xml:space="preserve">Guarantees the shape the rules engine needs; nulls instead of guesses for unreadable amounts</w:t>
+            </w:r>
+          </w:p>
+        </w:tc>
+      </w:tr>
+      <w:tr>
+        <w:trPr>
+          <w:tblHeader w:val="off"/>
+        </w:trPr>
+        <w:tc>
+          <w:tcPr>
+            <w:tcW w:type="dxa" w:w="2600"/>
+            <w:tcBorders>
+              <w:top w:val="single" w:color="BBBBBB" w:sz="1"/>
+              <w:left w:val="single" w:color="BBBBBB" w:sz="1"/>
+              <w:bottom w:val="single" w:color="BBBBBB" w:sz="1"/>
+              <w:right w:val="single" w:color="BBBBBB" w:sz="1"/>
+            </w:tcBorders>
+            <w:tcMar>
+              <w:top w:type="dxa" w:w="60"/>
+              <w:left w:type="dxa" w:w="100"/>
+              <w:bottom w:type="dxa" w:w="60"/>
+              <w:right w:type="dxa" w:w="100"/>
+            </w:tcMar>
+          </w:tcPr>
+          <w:p>
+            <w:r>
+              <w:rPr>
+                <w:b w:val="false"/>
+                <w:bCs w:val="false"/>
+                <w:sz w:val="20"/>
+                <w:szCs w:val="20"/>
+              </w:rPr>
+              <w:t xml:space="preserve">GPT-6 Luna</w:t>
+            </w:r>
+          </w:p>
+        </w:tc>
+        <w:tc>
+          <w:tcPr>
+            <w:tcW w:type="dxa" w:w="3400"/>
+            <w:tcBorders>
+              <w:top w:val="single" w:color="BBBBBB" w:sz="1"/>
+              <w:left w:val="single" w:color="BBBBBB" w:sz="1"/>
+              <w:bottom w:val="single" w:color="BBBBBB" w:sz="1"/>
+              <w:right w:val="single" w:color="BBBBBB" w:sz="1"/>
+            </w:tcBorders>
+            <w:tcMar>
+              <w:top w:type="dxa" w:w="60"/>
+              <w:left w:type="dxa" w:w="100"/>
+              <w:bottom w:type="dxa" w:w="60"/>
+              <w:right w:type="dxa" w:w="100"/>
+            </w:tcMar>
+          </w:tcPr>
+          <w:p>
+            <w:r>
+              <w:rPr>
+                <w:b w:val="false"/>
+                <w:bCs w:val="false"/>
+                <w:sz w:val="20"/>
+                <w:szCs w:val="20"/>
+              </w:rPr>
+              <w:t xml:space="preserve">Plain-language EN/Taglish line explanations (/api/explain)</w:t>
+            </w:r>
+          </w:p>
+        </w:tc>
+        <w:tc>
+          <w:tcPr>
+            <w:tcW w:type="dxa" w:w="3360"/>
+            <w:tcBorders>
+              <w:top w:val="single" w:color="BBBBBB" w:sz="1"/>
+              <w:left w:val="single" w:color="BBBBBB" w:sz="1"/>
+              <w:bottom w:val="single" w:color="BBBBBB" w:sz="1"/>
+              <w:right w:val="single" w:color="BBBBBB" w:sz="1"/>
+            </w:tcBorders>
+            <w:tcMar>
+              <w:top w:type="dxa" w:w="60"/>
+              <w:left w:type="dxa" w:w="100"/>
+              <w:bottom w:type="dxa" w:w="60"/>
+              <w:right w:type="dxa" w:w="100"/>
+            </w:tcMar>
+          </w:tcPr>
+          <w:p>
+            <w:r>
+              <w:rPr>
+                <w:b w:val="false"/>
+                <w:bCs w:val="false"/>
+                <w:sz w:val="20"/>
+                <w:szCs w:val="20"/>
+              </w:rPr>
+              <w:t xml:space="preserve">Cheapest model ($0.10/$0.50); short text task</w:t>
+            </w:r>
+          </w:p>
+        </w:tc>
+      </w:tr>
+      <w:tr>
+        <w:trPr>
+          <w:tblHeader w:val="off"/>
+        </w:trPr>
+        <w:tc>
+          <w:tcPr>
+            <w:tcW w:type="dxa" w:w="2600"/>
+            <w:tcBorders>
+              <w:top w:val="single" w:color="BBBBBB" w:sz="1"/>
+              <w:left w:val="single" w:color="BBBBBB" w:sz="1"/>
+              <w:bottom w:val="single" w:color="BBBBBB" w:sz="1"/>
+              <w:right w:val="single" w:color="BBBBBB" w:sz="1"/>
+            </w:tcBorders>
+            <w:tcMar>
+              <w:top w:type="dxa" w:w="60"/>
+              <w:left w:type="dxa" w:w="100"/>
+              <w:bottom w:type="dxa" w:w="60"/>
+              <w:right w:type="dxa" w:w="100"/>
+            </w:tcMar>
+          </w:tcPr>
+          <w:p>
+            <w:r>
+              <w:rPr>
+                <w:b w:val="false"/>
+                <w:bCs w:val="false"/>
+                <w:sz w:val="20"/>
+                <w:szCs w:val="20"/>
+              </w:rPr>
+              <w:t xml:space="preserve">GPT-6 Astra (escalation)</w:t>
+            </w:r>
+          </w:p>
+        </w:tc>
+        <w:tc>
+          <w:tcPr>
+            <w:tcW w:type="dxa" w:w="3400"/>
+            <w:tcBorders>
+              <w:top w:val="single" w:color="BBBBBB" w:sz="1"/>
+              <w:left w:val="single" w:color="BBBBBB" w:sz="1"/>
+              <w:bottom w:val="single" w:color="BBBBBB" w:sz="1"/>
+              <w:right w:val="single" w:color="BBBBBB" w:sz="1"/>
+            </w:tcBorders>
+            <w:tcMar>
+              <w:top w:type="dxa" w:w="60"/>
+              <w:left w:type="dxa" w:w="100"/>
+              <w:bottom w:type="dxa" w:w="60"/>
+              <w:right w:type="dxa" w:w="100"/>
+            </w:tcMar>
+          </w:tcPr>
+          <w:p>
+            <w:r>
+              <w:rPr>
+                <w:b w:val="false"/>
+                <w:bCs w:val="false"/>
+                <w:sz w:val="20"/>
+                <w:szCs w:val="20"/>
+              </w:rPr>
+              <w:t xml:space="preserve">One retry when several fields are low confidence or lines do not sum to the total</w:t>
+            </w:r>
+          </w:p>
+        </w:tc>
+        <w:tc>
+          <w:tcPr>
+            <w:tcW w:type="dxa" w:w="3360"/>
+            <w:tcBorders>
+              <w:top w:val="single" w:color="BBBBBB" w:sz="1"/>
+              <w:left w:val="single" w:color="BBBBBB" w:sz="1"/>
+              <w:bottom w:val="single" w:color="BBBBBB" w:sz="1"/>
+              <w:right w:val="single" w:color="BBBBBB" w:sz="1"/>
+            </w:tcBorders>
+            <w:tcMar>
+              <w:top w:type="dxa" w:w="60"/>
+              <w:left w:type="dxa" w:w="100"/>
+              <w:bottom w:type="dxa" w:w="60"/>
+              <w:right w:type="dxa" w:w="100"/>
+            </w:tcMar>
+          </w:tcPr>
+          <w:p>
+            <w:r>
+              <w:rPr>
+                <w:b w:val="false"/>
+                <w:bCs w:val="false"/>
+                <w:sz w:val="20"/>
+                <w:szCs w:val="20"/>
+              </w:rPr>
+              <w:t xml:space="preserve">Best accuracy only where needed, protects the $50 budget</w:t>
+            </w:r>
+          </w:p>
+        </w:tc>
+      </w:tr>
+      <w:tr>
+        <w:trPr>
+          <w:tblHeader w:val="off"/>
+        </w:trPr>
+        <w:tc>
+          <w:tcPr>
+            <w:tcW w:type="dxa" w:w="2600"/>
+            <w:tcBorders>
+              <w:top w:val="single" w:color="BBBBBB" w:sz="1"/>
+              <w:left w:val="single" w:color="BBBBBB" w:sz="1"/>
+              <w:bottom w:val="single" w:color="BBBBBB" w:sz="1"/>
+              <w:right w:val="single" w:color="BBBBBB" w:sz="1"/>
+            </w:tcBorders>
+            <w:tcMar>
+              <w:top w:type="dxa" w:w="60"/>
+              <w:left w:type="dxa" w:w="100"/>
+              <w:bottom w:type="dxa" w:w="60"/>
+              <w:right w:type="dxa" w:w="100"/>
+            </w:tcMar>
+          </w:tcPr>
+          <w:p>
+            <w:r>
+              <w:rPr>
+                <w:b w:val="false"/>
+                <w:bCs w:val="false"/>
+                <w:sz w:val="20"/>
+                <w:szCs w:val="20"/>
+              </w:rPr>
+              <w:t xml:space="preserve">store: false, output token caps</w:t>
+            </w:r>
+          </w:p>
+        </w:tc>
+        <w:tc>
+          <w:tcPr>
+            <w:tcW w:type="dxa" w:w="3400"/>
+            <w:tcBorders>
+              <w:top w:val="single" w:color="BBBBBB" w:sz="1"/>
+              <w:left w:val="single" w:color="BBBBBB" w:sz="1"/>
+              <w:bottom w:val="single" w:color="BBBBBB" w:sz="1"/>
+              <w:right w:val="single" w:color="BBBBBB" w:sz="1"/>
+            </w:tcBorders>
+            <w:tcMar>
+              <w:top w:type="dxa" w:w="60"/>
+              <w:left w:type="dxa" w:w="100"/>
+              <w:bottom w:type="dxa" w:w="60"/>
+              <w:right w:type="dxa" w:w="100"/>
+            </w:tcMar>
+          </w:tcPr>
+          <w:p>
+            <w:r>
+              <w:rPr>
+                <w:b w:val="false"/>
+                <w:bCs w:val="false"/>
+                <w:sz w:val="20"/>
+                <w:szCs w:val="20"/>
+              </w:rPr>
+              <w:t xml:space="preserve">Every OpenAI call</w:t>
+            </w:r>
+          </w:p>
+        </w:tc>
+        <w:tc>
+          <w:tcPr>
+            <w:tcW w:type="dxa" w:w="3360"/>
+            <w:tcBorders>
+              <w:top w:val="single" w:color="BBBBBB" w:sz="1"/>
+              <w:left w:val="single" w:color="BBBBBB" w:sz="1"/>
+              <w:bottom w:val="single" w:color="BBBBBB" w:sz="1"/>
+              <w:right w:val="single" w:color="BBBBBB" w:sz="1"/>
+            </w:tcBorders>
+            <w:tcMar>
+              <w:top w:type="dxa" w:w="60"/>
+              <w:left w:type="dxa" w:w="100"/>
+              <w:bottom w:type="dxa" w:w="60"/>
+              <w:right w:type="dxa" w:w="100"/>
+            </w:tcMar>
+          </w:tcPr>
+          <w:p>
+            <w:r>
+              <w:rPr>
+                <w:b w:val="false"/>
+                <w:bCs w:val="false"/>
+                <w:sz w:val="20"/>
+                <w:szCs w:val="20"/>
+              </w:rPr>
+              <w:t xml:space="preserve">Privacy (no stored bills) and cost control</w:t>
+            </w:r>
+          </w:p>
+        </w:tc>
+      </w:tr>
+      <w:tr>
+        <w:trPr>
+          <w:tblHeader w:val="off"/>
+        </w:trPr>
+        <w:tc>
+          <w:tcPr>
+            <w:tcW w:type="dxa" w:w="2600"/>
+            <w:tcBorders>
+              <w:top w:val="single" w:color="BBBBBB" w:sz="1"/>
+              <w:left w:val="single" w:color="BBBBBB" w:sz="1"/>
+              <w:bottom w:val="single" w:color="BBBBBB" w:sz="1"/>
+              <w:right w:val="single" w:color="BBBBBB" w:sz="1"/>
+            </w:tcBorders>
+            <w:tcMar>
+              <w:top w:type="dxa" w:w="60"/>
+              <w:left w:type="dxa" w:w="100"/>
+              <w:bottom w:type="dxa" w:w="60"/>
+              <w:right w:type="dxa" w:w="100"/>
+            </w:tcMar>
+          </w:tcPr>
+          <w:p>
+            <w:r>
+              <w:rPr>
+                <w:b w:val="false"/>
+                <w:bCs w:val="false"/>
+                <w:sz w:val="20"/>
+                <w:szCs w:val="20"/>
+              </w:rPr>
+              <w:t xml:space="preserve">Deterministic rules engine (not AI)</w:t>
+            </w:r>
+          </w:p>
+        </w:tc>
+        <w:tc>
+          <w:tcPr>
+            <w:tcW w:type="dxa" w:w="3400"/>
+            <w:tcBorders>
+              <w:top w:val="single" w:color="BBBBBB" w:sz="1"/>
+              <w:left w:val="single" w:color="BBBBBB" w:sz="1"/>
+              <w:bottom w:val="single" w:color="BBBBBB" w:sz="1"/>
+              <w:right w:val="single" w:color="BBBBBB" w:sz="1"/>
+            </w:tcBorders>
+            <w:tcMar>
+              <w:top w:type="dxa" w:w="60"/>
+              <w:left w:type="dxa" w:w="100"/>
+              <w:bottom w:type="dxa" w:w="60"/>
+              <w:right w:type="dxa" w:w="100"/>
+            </w:tcMar>
+          </w:tcPr>
+          <w:p>
+            <w:r>
+              <w:rPr>
+                <w:b w:val="false"/>
+                <w:bCs w:val="false"/>
+                <w:sz w:val="20"/>
+                <w:szCs w:val="20"/>
+              </w:rPr>
+              <w:t xml:space="preserve">Eligibility, balance range, checklist, letter</w:t>
+            </w:r>
+          </w:p>
+        </w:tc>
+        <w:tc>
+          <w:tcPr>
+            <w:tcW w:type="dxa" w:w="3360"/>
+            <w:tcBorders>
+              <w:top w:val="single" w:color="BBBBBB" w:sz="1"/>
+              <w:left w:val="single" w:color="BBBBBB" w:sz="1"/>
+              <w:bottom w:val="single" w:color="BBBBBB" w:sz="1"/>
+              <w:right w:val="single" w:color="BBBBBB" w:sz="1"/>
+            </w:tcBorders>
+            <w:tcMar>
+              <w:top w:type="dxa" w:w="60"/>
+              <w:left w:type="dxa" w:w="100"/>
+              <w:bottom w:type="dxa" w:w="60"/>
+              <w:right w:type="dxa" w:w="100"/>
+            </w:tcMar>
+          </w:tcPr>
+          <w:p>
+            <w:r>
+              <w:rPr>
+                <w:b w:val="false"/>
+                <w:bCs w:val="false"/>
+                <w:sz w:val="20"/>
+                <w:szCs w:val="20"/>
+              </w:rPr>
+              <w:t xml:space="preserve">Verifiable, source-cited results; AI reads and explains only</w:t>
+            </w:r>
+          </w:p>
+        </w:tc>
+      </w:tr>
+      <w:tr>
+        <w:trPr>
+          <w:tblHeader w:val="off"/>
+        </w:trPr>
+        <w:tc>
+          <w:tcPr>
+            <w:tcW w:type="dxa" w:w="2600"/>
+            <w:tcBorders>
+              <w:top w:val="single" w:color="BBBBBB" w:sz="1"/>
+              <w:left w:val="single" w:color="BBBBBB" w:sz="1"/>
+              <w:bottom w:val="single" w:color="BBBBBB" w:sz="1"/>
+              <w:right w:val="single" w:color="BBBBBB" w:sz="1"/>
+            </w:tcBorders>
+            <w:tcMar>
+              <w:top w:type="dxa" w:w="60"/>
+              <w:left w:type="dxa" w:w="100"/>
+              <w:bottom w:type="dxa" w:w="60"/>
+              <w:right w:type="dxa" w:w="100"/>
+            </w:tcMar>
+          </w:tcPr>
+          <w:p>
+            <w:r>
+              <w:rPr>
+                <w:b w:val="false"/>
+                <w:bCs w:val="false"/>
+                <w:sz w:val="20"/>
+                <w:szCs w:val="20"/>
+              </w:rPr>
+              <w:t xml:space="preserve">Not used: Decisions API, Agents / computer use</w:t>
+            </w:r>
+          </w:p>
+        </w:tc>
+        <w:tc>
+          <w:tcPr>
+            <w:tcW w:type="dxa" w:w="3400"/>
+            <w:tcBorders>
+              <w:top w:val="single" w:color="BBBBBB" w:sz="1"/>
+              <w:left w:val="single" w:color="BBBBBB" w:sz="1"/>
+              <w:bottom w:val="single" w:color="BBBBBB" w:sz="1"/>
+              <w:right w:val="single" w:color="BBBBBB" w:sz="1"/>
+            </w:tcBorders>
+            <w:tcMar>
+              <w:top w:type="dxa" w:w="60"/>
+              <w:left w:type="dxa" w:w="100"/>
+              <w:bottom w:type="dxa" w:w="60"/>
+              <w:right w:type="dxa" w:w="100"/>
+            </w:tcMar>
+          </w:tcPr>
+          <w:p>
+            <w:r>
+              <w:rPr>
+                <w:b w:val="false"/>
+                <w:bCs w:val="false"/>
+                <w:sz w:val="20"/>
+                <w:szCs w:val="20"/>
+              </w:rPr>
+              <w:t xml:space="preserve">n/a</w:t>
+            </w:r>
+          </w:p>
+        </w:tc>
+        <w:tc>
+          <w:tcPr>
+            <w:tcW w:type="dxa" w:w="3360"/>
+            <w:tcBorders>
+              <w:top w:val="single" w:color="BBBBBB" w:sz="1"/>
+              <w:left w:val="single" w:color="BBBBBB" w:sz="1"/>
+              <w:bottom w:val="single" w:color="BBBBBB" w:sz="1"/>
+              <w:right w:val="single" w:color="BBBBBB" w:sz="1"/>
+            </w:tcBorders>
+            <w:tcMar>
+              <w:top w:type="dxa" w:w="60"/>
+              <w:left w:type="dxa" w:w="100"/>
+              <w:bottom w:type="dxa" w:w="60"/>
+              <w:right w:type="dxa" w:w="100"/>
+            </w:tcMar>
+          </w:tcPr>
+          <w:p>
+            <w:r>
+              <w:rPr>
+                <w:b w:val="false"/>
+                <w:bCs w:val="false"/>
+                <w:sz w:val="20"/>
+                <w:szCs w:val="20"/>
+              </w:rPr>
+              <w:t xml:space="preserve">Limited preview or no value for an MVP that does not transact with agencies</w:t>
+            </w:r>
+          </w:p>
+        </w:tc>
+      </w:tr>
+    </w:tbl>
+    <w:p>
+      <w:pPr>
+        <w:spacing w:after="100"/>
+      </w:pPr>
+      <w:r>
+        <w:rPr>
+          <w:i/>
+          <w:iCs/>
+        </w:rPr>
+        <w:t xml:space="preserve">Build workflow: Codex used for coding tasks and for the program-rule research pass; Claude Code used for scaffolding. Log concrete Codex moments for the submission.</w:t>
+      </w:r>
+    </w:p>
+    <w:p>
+      <w:pPr>
+        <w:pStyle w:val="Heading1"/>
+      </w:pPr>
+      <w:r>
+        <w:t xml:space="preserve">9. Open Questions &amp; Risks</w:t>
       </w:r>
     </w:p>
     <w:tbl>
@@ -5447,7 +6575,7 @@
                 <w:sz w:val="20"/>
                 <w:szCs w:val="20"/>
               </w:rPr>
-              <w:t xml:space="preserve">Program rules (ZBB, MAIFIP, AICS, PCSO, Malasakit) are unverified against official DOH, PhilHealth, DSWD and PCSO circulars.</w:t>
+              <w:t xml:space="preserve">Full text of DOH DO 2026-0443 (ZBB) and AO 2026-0031 (MAIFIP) not yet read; only official notices were checked. Income rule, non-member enrollment, outpatient scope and exact documents are unverified.</w:t>
             </w:r>
           </w:p>
         </w:tc>
@@ -5475,7 +6603,7 @@
                 <w:sz w:val="20"/>
                 <w:szCs w:val="20"/>
               </w:rPr>
-              <w:t xml:space="preserve">Label results as estimates, show source and lastVerified, list under limitations. Next: verify with agencies.</w:t>
+              <w:t xml:space="preserve">Show 'Likely', not 'Applies', for ZBB and MAIFIP; show caveat per program; read both orders after the demo.</w:t>
             </w:r>
           </w:p>
         </w:tc>
@@ -5536,7 +6664,7 @@
                 <w:sz w:val="20"/>
                 <w:szCs w:val="20"/>
               </w:rPr>
-              <w:t xml:space="preserve">Whether the four GOCC specialty hospitals (NKTI, Lung Center, Heart Center, PCMC) are excluded from ZBB; MAIFIP expansion to private hospitals uncertain.</w:t>
+              <w:t xml:space="preserve">ZBB now includes the four GOCC specialty hospitals per the 18 Sep 2026 notice (earlier guidance said DOH-retained only). LGU expansion is limited; MAIFIP at private hospitals only for participating facilities.</w:t>
             </w:r>
           </w:p>
         </w:tc>
@@ -5564,7 +6692,7 @@
                 <w:sz w:val="20"/>
                 <w:szCs w:val="20"/>
               </w:rPr>
-              <w:t xml:space="preserve">Encode as 'confirm with hospital' states, not hard results.</w:t>
+              <w:t xml:space="preserve">Hospital-type question tells the user to confirm. LGU treated as 'maybe'.</w:t>
             </w:r>
           </w:p>
         </w:tc>
@@ -5625,7 +6753,7 @@
                 <w:sz w:val="20"/>
                 <w:szCs w:val="20"/>
               </w:rPr>
-              <w:t xml:space="preserve">RA 9439 citation for the no-detention rule needs verification before display.</w:t>
+              <w:t xml:space="preserve">RA 9439 is confirmed as the anti-detention law (2007), with a private-room exclusion and a promissory-note release. Separate from RA 10932 (deposits). No amendment found.</w:t>
             </w:r>
           </w:p>
         </w:tc>
@@ -5653,7 +6781,185 @@
                 <w:sz w:val="20"/>
                 <w:szCs w:val="20"/>
               </w:rPr>
-              <w:t xml:space="preserve">Verify before showing; otherwise show generic wording.</w:t>
+              <w:t xml:space="preserve">Rights card cites RA 9439 and states the private-room exception.</w:t>
+            </w:r>
+          </w:p>
+        </w:tc>
+      </w:tr>
+      <w:tr>
+        <w:trPr>
+          <w:tblHeader w:val="off"/>
+        </w:trPr>
+        <w:tc>
+          <w:tcPr>
+            <w:tcW w:type="dxa" w:w="700"/>
+            <w:tcBorders>
+              <w:top w:val="single" w:color="BBBBBB" w:sz="1"/>
+              <w:left w:val="single" w:color="BBBBBB" w:sz="1"/>
+              <w:bottom w:val="single" w:color="BBBBBB" w:sz="1"/>
+              <w:right w:val="single" w:color="BBBBBB" w:sz="1"/>
+            </w:tcBorders>
+            <w:tcMar>
+              <w:top w:type="dxa" w:w="60"/>
+              <w:left w:type="dxa" w:w="100"/>
+              <w:bottom w:type="dxa" w:w="60"/>
+              <w:right w:type="dxa" w:w="100"/>
+            </w:tcMar>
+          </w:tcPr>
+          <w:p>
+            <w:r>
+              <w:rPr>
+                <w:b w:val="false"/>
+                <w:bCs w:val="false"/>
+                <w:sz w:val="20"/>
+                <w:szCs w:val="20"/>
+              </w:rPr>
+              <w:t xml:space="preserve">3a</w:t>
+            </w:r>
+          </w:p>
+        </w:tc>
+        <w:tc>
+          <w:tcPr>
+            <w:tcW w:type="dxa" w:w="5000"/>
+            <w:tcBorders>
+              <w:top w:val="single" w:color="BBBBBB" w:sz="1"/>
+              <w:left w:val="single" w:color="BBBBBB" w:sz="1"/>
+              <w:bottom w:val="single" w:color="BBBBBB" w:sz="1"/>
+              <w:right w:val="single" w:color="BBBBBB" w:sz="1"/>
+            </w:tcBorders>
+            <w:tcMar>
+              <w:top w:type="dxa" w:w="60"/>
+              <w:left w:type="dxa" w:w="100"/>
+              <w:bottom w:type="dxa" w:w="60"/>
+              <w:right w:type="dxa" w:w="100"/>
+            </w:tcMar>
+          </w:tcPr>
+          <w:p>
+            <w:r>
+              <w:rPr>
+                <w:b w:val="false"/>
+                <w:bCs w:val="false"/>
+                <w:sz w:val="20"/>
+                <w:szCs w:val="20"/>
+              </w:rPr>
+              <w:t xml:space="preserve">Whether PCSO pays doctors' professional fees, how a patient gets reimbursed if PhilHealth was not deducted, and whether agency guarantee letters continue after the 2026 budget are unverified.</w:t>
+            </w:r>
+          </w:p>
+        </w:tc>
+        <w:tc>
+          <w:tcPr>
+            <w:tcW w:type="dxa" w:w="3660"/>
+            <w:tcBorders>
+              <w:top w:val="single" w:color="BBBBBB" w:sz="1"/>
+              <w:left w:val="single" w:color="BBBBBB" w:sz="1"/>
+              <w:bottom w:val="single" w:color="BBBBBB" w:sz="1"/>
+              <w:right w:val="single" w:color="BBBBBB" w:sz="1"/>
+            </w:tcBorders>
+            <w:tcMar>
+              <w:top w:type="dxa" w:w="60"/>
+              <w:left w:type="dxa" w:w="100"/>
+              <w:bottom w:type="dxa" w:w="60"/>
+              <w:right w:type="dxa" w:w="100"/>
+            </w:tcMar>
+          </w:tcPr>
+          <w:p>
+            <w:r>
+              <w:rPr>
+                <w:b w:val="false"/>
+                <w:bCs w:val="false"/>
+                <w:sz w:val="20"/>
+                <w:szCs w:val="20"/>
+              </w:rPr>
+              <w:t xml:space="preserve">Do not promise these; every plan includes 'ask billing / social worker'.</w:t>
+            </w:r>
+          </w:p>
+        </w:tc>
+      </w:tr>
+      <w:tr>
+        <w:trPr>
+          <w:tblHeader w:val="off"/>
+        </w:trPr>
+        <w:tc>
+          <w:tcPr>
+            <w:tcW w:type="dxa" w:w="700"/>
+            <w:tcBorders>
+              <w:top w:val="single" w:color="BBBBBB" w:sz="1"/>
+              <w:left w:val="single" w:color="BBBBBB" w:sz="1"/>
+              <w:bottom w:val="single" w:color="BBBBBB" w:sz="1"/>
+              <w:right w:val="single" w:color="BBBBBB" w:sz="1"/>
+            </w:tcBorders>
+            <w:tcMar>
+              <w:top w:type="dxa" w:w="60"/>
+              <w:left w:type="dxa" w:w="100"/>
+              <w:bottom w:type="dxa" w:w="60"/>
+              <w:right w:type="dxa" w:w="100"/>
+            </w:tcMar>
+          </w:tcPr>
+          <w:p>
+            <w:r>
+              <w:rPr>
+                <w:b w:val="false"/>
+                <w:bCs w:val="false"/>
+                <w:sz w:val="20"/>
+                <w:szCs w:val="20"/>
+              </w:rPr>
+              <w:t xml:space="preserve">3b</w:t>
+            </w:r>
+          </w:p>
+        </w:tc>
+        <w:tc>
+          <w:tcPr>
+            <w:tcW w:type="dxa" w:w="5000"/>
+            <w:tcBorders>
+              <w:top w:val="single" w:color="BBBBBB" w:sz="1"/>
+              <w:left w:val="single" w:color="BBBBBB" w:sz="1"/>
+              <w:bottom w:val="single" w:color="BBBBBB" w:sz="1"/>
+              <w:right w:val="single" w:color="BBBBBB" w:sz="1"/>
+            </w:tcBorders>
+            <w:tcMar>
+              <w:top w:type="dxa" w:w="60"/>
+              <w:left w:type="dxa" w:w="100"/>
+              <w:bottom w:type="dxa" w:w="60"/>
+              <w:right w:type="dxa" w:w="100"/>
+            </w:tcMar>
+          </w:tcPr>
+          <w:p>
+            <w:r>
+              <w:rPr>
+                <w:b w:val="false"/>
+                <w:bCs w:val="false"/>
+                <w:sz w:val="20"/>
+                <w:szCs w:val="20"/>
+              </w:rPr>
+              <w:t xml:space="preserve">OpenAI Decisions API is limited preview and Agents/computer use add little to an MVP.</w:t>
+            </w:r>
+          </w:p>
+        </w:tc>
+        <w:tc>
+          <w:tcPr>
+            <w:tcW w:type="dxa" w:w="3660"/>
+            <w:tcBorders>
+              <w:top w:val="single" w:color="BBBBBB" w:sz="1"/>
+              <w:left w:val="single" w:color="BBBBBB" w:sz="1"/>
+              <w:bottom w:val="single" w:color="BBBBBB" w:sz="1"/>
+              <w:right w:val="single" w:color="BBBBBB" w:sz="1"/>
+            </w:tcBorders>
+            <w:tcMar>
+              <w:top w:type="dxa" w:w="60"/>
+              <w:left w:type="dxa" w:w="100"/>
+              <w:bottom w:type="dxa" w:w="60"/>
+              <w:right w:type="dxa" w:w="100"/>
+            </w:tcMar>
+          </w:tcPr>
+          <w:p>
+            <w:r>
+              <w:rPr>
+                <w:b w:val="false"/>
+                <w:bCs w:val="false"/>
+                <w:sz w:val="20"/>
+                <w:szCs w:val="20"/>
+              </w:rPr>
+              <w:t xml:space="preserve">Not used. Eligibility stays in own deterministic code. Listed as a possible later classifier.</w:t>
             </w:r>
           </w:p>
         </w:tc>

</xml_diff>

<commit_message>
Use OpenAI Decisions API to classify bill lines; update PRD
</commit_message>
<xml_diff>
--- a/PRD - Hospital Bill Navigator.docx
+++ b/PRD - Hospital Bill Navigator.docx
@@ -4500,6 +4500,123 @@
                 <w:sz w:val="20"/>
                 <w:szCs w:val="20"/>
               </w:rPr>
+              <w:t xml:space="preserve">FR01.20</w:t>
+            </w:r>
+          </w:p>
+        </w:tc>
+        <w:tc>
+          <w:tcPr>
+            <w:tcW w:type="dxa" w:w="5460"/>
+            <w:tcBorders>
+              <w:top w:val="single" w:color="BBBBBB" w:sz="1"/>
+              <w:left w:val="single" w:color="BBBBBB" w:sz="1"/>
+              <w:bottom w:val="single" w:color="BBBBBB" w:sz="1"/>
+              <w:right w:val="single" w:color="BBBBBB" w:sz="1"/>
+            </w:tcBorders>
+            <w:tcMar>
+              <w:top w:type="dxa" w:w="60"/>
+              <w:left w:type="dxa" w:w="100"/>
+              <w:bottom w:type="dxa" w:w="60"/>
+              <w:right w:type="dxa" w:w="100"/>
+            </w:tcMar>
+          </w:tcPr>
+          <w:p>
+            <w:r>
+              <w:rPr>
+                <w:b w:val="false"/>
+                <w:bCs w:val="false"/>
+                <w:sz w:val="20"/>
+                <w:szCs w:val="20"/>
+              </w:rPr>
+              <w:t xml:space="preserve">The system shall classify each extracted line with the OpenAI Decisions API (GPT-6 Luna, single-choice question), adopt the answer when it disagrees with the extraction at 0.8 confidence or higher, and flag the line for review when confidence is below 0.7.</w:t>
+            </w:r>
+          </w:p>
+        </w:tc>
+        <w:tc>
+          <w:tcPr>
+            <w:tcW w:type="dxa" w:w="1200"/>
+            <w:tcBorders>
+              <w:top w:val="single" w:color="BBBBBB" w:sz="1"/>
+              <w:left w:val="single" w:color="BBBBBB" w:sz="1"/>
+              <w:bottom w:val="single" w:color="BBBBBB" w:sz="1"/>
+              <w:right w:val="single" w:color="BBBBBB" w:sz="1"/>
+            </w:tcBorders>
+            <w:tcMar>
+              <w:top w:type="dxa" w:w="60"/>
+              <w:left w:type="dxa" w:w="100"/>
+              <w:bottom w:type="dxa" w:w="60"/>
+              <w:right w:type="dxa" w:w="100"/>
+            </w:tcMar>
+          </w:tcPr>
+          <w:p>
+            <w:r>
+              <w:rPr>
+                <w:b w:val="false"/>
+                <w:bCs w:val="false"/>
+                <w:sz w:val="20"/>
+                <w:szCs w:val="20"/>
+              </w:rPr>
+              <w:t xml:space="preserve">S</w:t>
+            </w:r>
+          </w:p>
+        </w:tc>
+        <w:tc>
+          <w:tcPr>
+            <w:tcW w:type="dxa" w:w="1800"/>
+            <w:tcBorders>
+              <w:top w:val="single" w:color="BBBBBB" w:sz="1"/>
+              <w:left w:val="single" w:color="BBBBBB" w:sz="1"/>
+              <w:bottom w:val="single" w:color="BBBBBB" w:sz="1"/>
+              <w:right w:val="single" w:color="BBBBBB" w:sz="1"/>
+            </w:tcBorders>
+            <w:tcMar>
+              <w:top w:type="dxa" w:w="60"/>
+              <w:left w:type="dxa" w:w="100"/>
+              <w:bottom w:type="dxa" w:w="60"/>
+              <w:right w:type="dxa" w:w="100"/>
+            </w:tcMar>
+          </w:tcPr>
+          <w:p>
+            <w:r>
+              <w:rPr>
+                <w:b w:val="false"/>
+                <w:bCs w:val="false"/>
+                <w:sz w:val="20"/>
+                <w:szCs w:val="20"/>
+              </w:rPr>
+              <w:t xml:space="preserve">US1.10</w:t>
+            </w:r>
+          </w:p>
+        </w:tc>
+      </w:tr>
+      <w:tr>
+        <w:trPr>
+          <w:tblHeader w:val="off"/>
+        </w:trPr>
+        <w:tc>
+          <w:tcPr>
+            <w:tcW w:type="dxa" w:w="900"/>
+            <w:tcBorders>
+              <w:top w:val="single" w:color="BBBBBB" w:sz="1"/>
+              <w:left w:val="single" w:color="BBBBBB" w:sz="1"/>
+              <w:bottom w:val="single" w:color="BBBBBB" w:sz="1"/>
+              <w:right w:val="single" w:color="BBBBBB" w:sz="1"/>
+            </w:tcBorders>
+            <w:tcMar>
+              <w:top w:type="dxa" w:w="60"/>
+              <w:left w:type="dxa" w:w="100"/>
+              <w:bottom w:type="dxa" w:w="60"/>
+              <w:right w:type="dxa" w:w="100"/>
+            </w:tcMar>
+          </w:tcPr>
+          <w:p>
+            <w:r>
+              <w:rPr>
+                <w:b w:val="false"/>
+                <w:bCs w:val="false"/>
+                <w:sz w:val="20"/>
+                <w:szCs w:val="20"/>
+              </w:rPr>
               <w:t xml:space="preserve">FR01.19</w:t>
             </w:r>
           </w:p>
@@ -6328,7 +6445,7 @@
                 <w:sz w:val="20"/>
                 <w:szCs w:val="20"/>
               </w:rPr>
-              <w:t xml:space="preserve">Not used: Decisions API, Agents / computer use</w:t>
+              <w:t xml:space="preserve">Decisions API (public beta since 6 Oct 2026) with GPT-6 Luna</w:t>
             </w:r>
           </w:p>
         </w:tc>
@@ -6356,6 +6473,95 @@
                 <w:sz w:val="20"/>
                 <w:szCs w:val="20"/>
               </w:rPr>
+              <w:t xml:space="preserve">Second-opinion category for every bill line (room, medicine, lab, doctor's fee, supplies, deduction, other) with confidence, right after extraction</w:t>
+            </w:r>
+          </w:p>
+        </w:tc>
+        <w:tc>
+          <w:tcPr>
+            <w:tcW w:type="dxa" w:w="3360"/>
+            <w:tcBorders>
+              <w:top w:val="single" w:color="BBBBBB" w:sz="1"/>
+              <w:left w:val="single" w:color="BBBBBB" w:sz="1"/>
+              <w:bottom w:val="single" w:color="BBBBBB" w:sz="1"/>
+              <w:right w:val="single" w:color="BBBBBB" w:sz="1"/>
+            </w:tcBorders>
+            <w:tcMar>
+              <w:top w:type="dxa" w:w="60"/>
+              <w:left w:type="dxa" w:w="100"/>
+              <w:bottom w:type="dxa" w:w="60"/>
+              <w:right w:type="dxa" w:w="100"/>
+            </w:tcMar>
+          </w:tcPr>
+          <w:p>
+            <w:r>
+              <w:rPr>
+                <w:b w:val="false"/>
+                <w:bCs w:val="false"/>
+                <w:sz w:val="20"/>
+                <w:szCs w:val="20"/>
+              </w:rPr>
+              <w:t xml:space="preserve">Finite-answer questions with probabilities suit classification; the category drives rules (e.g. doctor's fee during a ZBB stay), and low confidence flags the line for the user to check</w:t>
+            </w:r>
+          </w:p>
+        </w:tc>
+      </w:tr>
+      <w:tr>
+        <w:trPr>
+          <w:tblHeader w:val="off"/>
+        </w:trPr>
+        <w:tc>
+          <w:tcPr>
+            <w:tcW w:type="dxa" w:w="2600"/>
+            <w:tcBorders>
+              <w:top w:val="single" w:color="BBBBBB" w:sz="1"/>
+              <w:left w:val="single" w:color="BBBBBB" w:sz="1"/>
+              <w:bottom w:val="single" w:color="BBBBBB" w:sz="1"/>
+              <w:right w:val="single" w:color="BBBBBB" w:sz="1"/>
+            </w:tcBorders>
+            <w:tcMar>
+              <w:top w:type="dxa" w:w="60"/>
+              <w:left w:type="dxa" w:w="100"/>
+              <w:bottom w:type="dxa" w:w="60"/>
+              <w:right w:type="dxa" w:w="100"/>
+            </w:tcMar>
+          </w:tcPr>
+          <w:p>
+            <w:r>
+              <w:rPr>
+                <w:b w:val="false"/>
+                <w:bCs w:val="false"/>
+                <w:sz w:val="20"/>
+                <w:szCs w:val="20"/>
+              </w:rPr>
+              <w:t xml:space="preserve">Not used: Agents / computer use</w:t>
+            </w:r>
+          </w:p>
+        </w:tc>
+        <w:tc>
+          <w:tcPr>
+            <w:tcW w:type="dxa" w:w="3400"/>
+            <w:tcBorders>
+              <w:top w:val="single" w:color="BBBBBB" w:sz="1"/>
+              <w:left w:val="single" w:color="BBBBBB" w:sz="1"/>
+              <w:bottom w:val="single" w:color="BBBBBB" w:sz="1"/>
+              <w:right w:val="single" w:color="BBBBBB" w:sz="1"/>
+            </w:tcBorders>
+            <w:tcMar>
+              <w:top w:type="dxa" w:w="60"/>
+              <w:left w:type="dxa" w:w="100"/>
+              <w:bottom w:type="dxa" w:w="60"/>
+              <w:right w:type="dxa" w:w="100"/>
+            </w:tcMar>
+          </w:tcPr>
+          <w:p>
+            <w:r>
+              <w:rPr>
+                <w:b w:val="false"/>
+                <w:bCs w:val="false"/>
+                <w:sz w:val="20"/>
+                <w:szCs w:val="20"/>
+              </w:rPr>
               <w:t xml:space="preserve">n/a</w:t>
             </w:r>
           </w:p>
@@ -6384,7 +6590,7 @@
                 <w:sz w:val="20"/>
                 <w:szCs w:val="20"/>
               </w:rPr>
-              <w:t xml:space="preserve">Limited preview or no value for an MVP that does not transact with agencies</w:t>
+              <w:t xml:space="preserve">No value for an MVP that does not transact with agencies</w:t>
             </w:r>
           </w:p>
         </w:tc>
@@ -6931,7 +7137,7 @@
                 <w:sz w:val="20"/>
                 <w:szCs w:val="20"/>
               </w:rPr>
-              <w:t xml:space="preserve">OpenAI Decisions API is limited preview and Agents/computer use add little to an MVP.</w:t>
+              <w:t xml:space="preserve">Decisions API is a public beta feature and may change. Its output is a classification, not an eligibility ruling.</w:t>
             </w:r>
           </w:p>
         </w:tc>
@@ -6959,7 +7165,7 @@
                 <w:sz w:val="20"/>
                 <w:szCs w:val="20"/>
               </w:rPr>
-              <w:t xml:space="preserve">Not used. Eligibility stays in own deterministic code. Listed as a possible later classifier.</w:t>
+              <w:t xml:space="preserve">Used only to classify bill lines. Eligibility stays in own deterministic code; the extraction stands if the call fails.</w:t>
             </w:r>
           </w:p>
         </w:tc>

</xml_diff>

<commit_message>
Auto-detect and double-check hospital type; Taglish plan; progress persistence; other-cover input; PRD update
</commit_message>
<xml_diff>
--- a/PRD - Hospital Bill Navigator.docx
+++ b/PRD - Hospital Bill Navigator.docx
@@ -2068,6 +2068,95 @@
                 <w:sz w:val="20"/>
                 <w:szCs w:val="20"/>
               </w:rPr>
+              <w:t xml:space="preserve">US1.13</w:t>
+            </w:r>
+          </w:p>
+        </w:tc>
+        <w:tc>
+          <w:tcPr>
+            <w:tcW w:type="dxa" w:w="6660"/>
+            <w:tcBorders>
+              <w:top w:val="single" w:color="BBBBBB" w:sz="1"/>
+              <w:left w:val="single" w:color="BBBBBB" w:sz="1"/>
+              <w:bottom w:val="single" w:color="BBBBBB" w:sz="1"/>
+              <w:right w:val="single" w:color="BBBBBB" w:sz="1"/>
+            </w:tcBorders>
+            <w:tcMar>
+              <w:top w:type="dxa" w:w="60"/>
+              <w:left w:type="dxa" w:w="100"/>
+              <w:bottom w:type="dxa" w:w="60"/>
+              <w:right w:type="dxa" w:w="100"/>
+            </w:tcMar>
+          </w:tcPr>
+          <w:p>
+            <w:r>
+              <w:rPr>
+                <w:b w:val="false"/>
+                <w:bCs w:val="false"/>
+                <w:sz w:val="20"/>
+                <w:szCs w:val="20"/>
+              </w:rPr>
+              <w:t xml:space="preserve">As a family member, I do not want to answer questions the bill already answers (hospital type, room, admitted or outpatient, PhilHealth, discounts) so that I finish faster, and I want those answers checked so I can trust them.</w:t>
+            </w:r>
+          </w:p>
+        </w:tc>
+        <w:tc>
+          <w:tcPr>
+            <w:tcW w:type="dxa" w:w="1800"/>
+            <w:tcBorders>
+              <w:top w:val="single" w:color="BBBBBB" w:sz="1"/>
+              <w:left w:val="single" w:color="BBBBBB" w:sz="1"/>
+              <w:bottom w:val="single" w:color="BBBBBB" w:sz="1"/>
+              <w:right w:val="single" w:color="BBBBBB" w:sz="1"/>
+            </w:tcBorders>
+            <w:tcMar>
+              <w:top w:type="dxa" w:w="60"/>
+              <w:left w:type="dxa" w:w="100"/>
+              <w:bottom w:type="dxa" w:w="60"/>
+              <w:right w:type="dxa" w:w="100"/>
+            </w:tcMar>
+          </w:tcPr>
+          <w:p>
+            <w:r>
+              <w:rPr>
+                <w:b w:val="false"/>
+                <w:bCs w:val="false"/>
+                <w:sz w:val="20"/>
+                <w:szCs w:val="20"/>
+              </w:rPr>
+              <w:t xml:space="preserve">M</w:t>
+            </w:r>
+          </w:p>
+        </w:tc>
+      </w:tr>
+      <w:tr>
+        <w:trPr>
+          <w:tblHeader w:val="off"/>
+        </w:trPr>
+        <w:tc>
+          <w:tcPr>
+            <w:tcW w:type="dxa" w:w="900"/>
+            <w:tcBorders>
+              <w:top w:val="single" w:color="BBBBBB" w:sz="1"/>
+              <w:left w:val="single" w:color="BBBBBB" w:sz="1"/>
+              <w:bottom w:val="single" w:color="BBBBBB" w:sz="1"/>
+              <w:right w:val="single" w:color="BBBBBB" w:sz="1"/>
+            </w:tcBorders>
+            <w:tcMar>
+              <w:top w:type="dxa" w:w="60"/>
+              <w:left w:type="dxa" w:w="100"/>
+              <w:bottom w:type="dxa" w:w="60"/>
+              <w:right w:type="dxa" w:w="100"/>
+            </w:tcMar>
+          </w:tcPr>
+          <w:p>
+            <w:r>
+              <w:rPr>
+                <w:b w:val="false"/>
+                <w:bCs w:val="false"/>
+                <w:sz w:val="20"/>
+                <w:szCs w:val="20"/>
+              </w:rPr>
               <w:t xml:space="preserve">US1.11</w:t>
             </w:r>
           </w:p>
@@ -4617,6 +4706,708 @@
                 <w:sz w:val="20"/>
                 <w:szCs w:val="20"/>
               </w:rPr>
+              <w:t xml:space="preserve">FR01.21</w:t>
+            </w:r>
+          </w:p>
+        </w:tc>
+        <w:tc>
+          <w:tcPr>
+            <w:tcW w:type="dxa" w:w="5460"/>
+            <w:tcBorders>
+              <w:top w:val="single" w:color="BBBBBB" w:sz="1"/>
+              <w:left w:val="single" w:color="BBBBBB" w:sz="1"/>
+              <w:bottom w:val="single" w:color="BBBBBB" w:sz="1"/>
+              <w:right w:val="single" w:color="BBBBBB" w:sz="1"/>
+            </w:tcBorders>
+            <w:tcMar>
+              <w:top w:type="dxa" w:w="60"/>
+              <w:left w:type="dxa" w:w="100"/>
+              <w:bottom w:type="dxa" w:w="60"/>
+              <w:right w:type="dxa" w:w="100"/>
+            </w:tcMar>
+          </w:tcPr>
+          <w:p>
+            <w:r>
+              <w:rPr>
+                <w:b w:val="false"/>
+                <w:bCs w:val="false"/>
+                <w:sz w:val="20"/>
+                <w:szCs w:val="20"/>
+              </w:rPr>
+              <w:t xml:space="preserve">On upload the system shall automatically determine the hospital type (DOH, city/provincial LGU, private) from the hospital name, address and header text on the SOA and pre-fill the answer, without asking the user first.</w:t>
+            </w:r>
+          </w:p>
+        </w:tc>
+        <w:tc>
+          <w:tcPr>
+            <w:tcW w:type="dxa" w:w="1200"/>
+            <w:tcBorders>
+              <w:top w:val="single" w:color="BBBBBB" w:sz="1"/>
+              <w:left w:val="single" w:color="BBBBBB" w:sz="1"/>
+              <w:bottom w:val="single" w:color="BBBBBB" w:sz="1"/>
+              <w:right w:val="single" w:color="BBBBBB" w:sz="1"/>
+            </w:tcBorders>
+            <w:tcMar>
+              <w:top w:type="dxa" w:w="60"/>
+              <w:left w:type="dxa" w:w="100"/>
+              <w:bottom w:type="dxa" w:w="60"/>
+              <w:right w:type="dxa" w:w="100"/>
+            </w:tcMar>
+          </w:tcPr>
+          <w:p>
+            <w:r>
+              <w:rPr>
+                <w:b w:val="false"/>
+                <w:bCs w:val="false"/>
+                <w:sz w:val="20"/>
+                <w:szCs w:val="20"/>
+              </w:rPr>
+              <w:t xml:space="preserve">M</w:t>
+            </w:r>
+          </w:p>
+        </w:tc>
+        <w:tc>
+          <w:tcPr>
+            <w:tcW w:type="dxa" w:w="1800"/>
+            <w:tcBorders>
+              <w:top w:val="single" w:color="BBBBBB" w:sz="1"/>
+              <w:left w:val="single" w:color="BBBBBB" w:sz="1"/>
+              <w:bottom w:val="single" w:color="BBBBBB" w:sz="1"/>
+              <w:right w:val="single" w:color="BBBBBB" w:sz="1"/>
+            </w:tcBorders>
+            <w:tcMar>
+              <w:top w:type="dxa" w:w="60"/>
+              <w:left w:type="dxa" w:w="100"/>
+              <w:bottom w:type="dxa" w:w="60"/>
+              <w:right w:type="dxa" w:w="100"/>
+            </w:tcMar>
+          </w:tcPr>
+          <w:p>
+            <w:r>
+              <w:rPr>
+                <w:b w:val="false"/>
+                <w:bCs w:val="false"/>
+                <w:sz w:val="20"/>
+                <w:szCs w:val="20"/>
+              </w:rPr>
+              <w:t xml:space="preserve">US1.13</w:t>
+            </w:r>
+          </w:p>
+        </w:tc>
+      </w:tr>
+      <w:tr>
+        <w:trPr>
+          <w:tblHeader w:val="off"/>
+        </w:trPr>
+        <w:tc>
+          <w:tcPr>
+            <w:tcW w:type="dxa" w:w="900"/>
+            <w:tcBorders>
+              <w:top w:val="single" w:color="BBBBBB" w:sz="1"/>
+              <w:left w:val="single" w:color="BBBBBB" w:sz="1"/>
+              <w:bottom w:val="single" w:color="BBBBBB" w:sz="1"/>
+              <w:right w:val="single" w:color="BBBBBB" w:sz="1"/>
+            </w:tcBorders>
+            <w:tcMar>
+              <w:top w:type="dxa" w:w="60"/>
+              <w:left w:type="dxa" w:w="100"/>
+              <w:bottom w:type="dxa" w:w="60"/>
+              <w:right w:type="dxa" w:w="100"/>
+            </w:tcMar>
+          </w:tcPr>
+          <w:p>
+            <w:r>
+              <w:rPr>
+                <w:b w:val="false"/>
+                <w:bCs w:val="false"/>
+                <w:sz w:val="20"/>
+                <w:szCs w:val="20"/>
+              </w:rPr>
+              <w:t xml:space="preserve">FR01.22</w:t>
+            </w:r>
+          </w:p>
+        </w:tc>
+        <w:tc>
+          <w:tcPr>
+            <w:tcW w:type="dxa" w:w="5460"/>
+            <w:tcBorders>
+              <w:top w:val="single" w:color="BBBBBB" w:sz="1"/>
+              <w:left w:val="single" w:color="BBBBBB" w:sz="1"/>
+              <w:bottom w:val="single" w:color="BBBBBB" w:sz="1"/>
+              <w:right w:val="single" w:color="BBBBBB" w:sz="1"/>
+            </w:tcBorders>
+            <w:tcMar>
+              <w:top w:type="dxa" w:w="60"/>
+              <w:left w:type="dxa" w:w="100"/>
+              <w:bottom w:type="dxa" w:w="60"/>
+              <w:right w:type="dxa" w:w="100"/>
+            </w:tcMar>
+          </w:tcPr>
+          <w:p>
+            <w:r>
+              <w:rPr>
+                <w:b w:val="false"/>
+                <w:bCs w:val="false"/>
+                <w:sz w:val="20"/>
+                <w:szCs w:val="20"/>
+              </w:rPr>
+              <w:t xml:space="preserve">The system shall double-check the hospital type with two independent checks: (1) the OpenAI Decisions API (GPT-6 Luna) single-choice classification with confidence, and (2) a web-search verification with GPT-6.1 Sol that returns the owner, one sentence of evidence and a source link. Agreement is shown as Checked two ways; disagreement or failure is shown as Please double-check.</w:t>
+            </w:r>
+          </w:p>
+        </w:tc>
+        <w:tc>
+          <w:tcPr>
+            <w:tcW w:type="dxa" w:w="1200"/>
+            <w:tcBorders>
+              <w:top w:val="single" w:color="BBBBBB" w:sz="1"/>
+              <w:left w:val="single" w:color="BBBBBB" w:sz="1"/>
+              <w:bottom w:val="single" w:color="BBBBBB" w:sz="1"/>
+              <w:right w:val="single" w:color="BBBBBB" w:sz="1"/>
+            </w:tcBorders>
+            <w:tcMar>
+              <w:top w:type="dxa" w:w="60"/>
+              <w:left w:type="dxa" w:w="100"/>
+              <w:bottom w:type="dxa" w:w="60"/>
+              <w:right w:type="dxa" w:w="100"/>
+            </w:tcMar>
+          </w:tcPr>
+          <w:p>
+            <w:r>
+              <w:rPr>
+                <w:b w:val="false"/>
+                <w:bCs w:val="false"/>
+                <w:sz w:val="20"/>
+                <w:szCs w:val="20"/>
+              </w:rPr>
+              <w:t xml:space="preserve">M</w:t>
+            </w:r>
+          </w:p>
+        </w:tc>
+        <w:tc>
+          <w:tcPr>
+            <w:tcW w:type="dxa" w:w="1800"/>
+            <w:tcBorders>
+              <w:top w:val="single" w:color="BBBBBB" w:sz="1"/>
+              <w:left w:val="single" w:color="BBBBBB" w:sz="1"/>
+              <w:bottom w:val="single" w:color="BBBBBB" w:sz="1"/>
+              <w:right w:val="single" w:color="BBBBBB" w:sz="1"/>
+            </w:tcBorders>
+            <w:tcMar>
+              <w:top w:type="dxa" w:w="60"/>
+              <w:left w:type="dxa" w:w="100"/>
+              <w:bottom w:type="dxa" w:w="60"/>
+              <w:right w:type="dxa" w:w="100"/>
+            </w:tcMar>
+          </w:tcPr>
+          <w:p>
+            <w:r>
+              <w:rPr>
+                <w:b w:val="false"/>
+                <w:bCs w:val="false"/>
+                <w:sz w:val="20"/>
+                <w:szCs w:val="20"/>
+              </w:rPr>
+              <w:t xml:space="preserve">US1.13</w:t>
+            </w:r>
+          </w:p>
+        </w:tc>
+      </w:tr>
+      <w:tr>
+        <w:trPr>
+          <w:tblHeader w:val="off"/>
+        </w:trPr>
+        <w:tc>
+          <w:tcPr>
+            <w:tcW w:type="dxa" w:w="900"/>
+            <w:tcBorders>
+              <w:top w:val="single" w:color="BBBBBB" w:sz="1"/>
+              <w:left w:val="single" w:color="BBBBBB" w:sz="1"/>
+              <w:bottom w:val="single" w:color="BBBBBB" w:sz="1"/>
+              <w:right w:val="single" w:color="BBBBBB" w:sz="1"/>
+            </w:tcBorders>
+            <w:tcMar>
+              <w:top w:type="dxa" w:w="60"/>
+              <w:left w:type="dxa" w:w="100"/>
+              <w:bottom w:type="dxa" w:w="60"/>
+              <w:right w:type="dxa" w:w="100"/>
+            </w:tcMar>
+          </w:tcPr>
+          <w:p>
+            <w:r>
+              <w:rPr>
+                <w:b w:val="false"/>
+                <w:bCs w:val="false"/>
+                <w:sz w:val="20"/>
+                <w:szCs w:val="20"/>
+              </w:rPr>
+              <w:t xml:space="preserve">FR01.23</w:t>
+            </w:r>
+          </w:p>
+        </w:tc>
+        <w:tc>
+          <w:tcPr>
+            <w:tcW w:type="dxa" w:w="5460"/>
+            <w:tcBorders>
+              <w:top w:val="single" w:color="BBBBBB" w:sz="1"/>
+              <w:left w:val="single" w:color="BBBBBB" w:sz="1"/>
+              <w:bottom w:val="single" w:color="BBBBBB" w:sz="1"/>
+              <w:right w:val="single" w:color="BBBBBB" w:sz="1"/>
+            </w:tcBorders>
+            <w:tcMar>
+              <w:top w:type="dxa" w:w="60"/>
+              <w:left w:type="dxa" w:w="100"/>
+              <w:bottom w:type="dxa" w:w="60"/>
+              <w:right w:type="dxa" w:w="100"/>
+            </w:tcMar>
+          </w:tcPr>
+          <w:p>
+            <w:r>
+              <w:rPr>
+                <w:b w:val="false"/>
+                <w:bCs w:val="false"/>
+                <w:sz w:val="20"/>
+                <w:szCs w:val="20"/>
+              </w:rPr>
+              <w:t xml:space="preserve">The system shall also pre-fill room type (from the room line), admitted vs outpatient (from the presence of a room charge), PhilHealth membership (from a PhilHealth deduction line) and senior/PWD category (from a discount line), each labelled as filled in from the bill and editable.</w:t>
+            </w:r>
+          </w:p>
+        </w:tc>
+        <w:tc>
+          <w:tcPr>
+            <w:tcW w:type="dxa" w:w="1200"/>
+            <w:tcBorders>
+              <w:top w:val="single" w:color="BBBBBB" w:sz="1"/>
+              <w:left w:val="single" w:color="BBBBBB" w:sz="1"/>
+              <w:bottom w:val="single" w:color="BBBBBB" w:sz="1"/>
+              <w:right w:val="single" w:color="BBBBBB" w:sz="1"/>
+            </w:tcBorders>
+            <w:tcMar>
+              <w:top w:type="dxa" w:w="60"/>
+              <w:left w:type="dxa" w:w="100"/>
+              <w:bottom w:type="dxa" w:w="60"/>
+              <w:right w:type="dxa" w:w="100"/>
+            </w:tcMar>
+          </w:tcPr>
+          <w:p>
+            <w:r>
+              <w:rPr>
+                <w:b w:val="false"/>
+                <w:bCs w:val="false"/>
+                <w:sz w:val="20"/>
+                <w:szCs w:val="20"/>
+              </w:rPr>
+              <w:t xml:space="preserve">M</w:t>
+            </w:r>
+          </w:p>
+        </w:tc>
+        <w:tc>
+          <w:tcPr>
+            <w:tcW w:type="dxa" w:w="1800"/>
+            <w:tcBorders>
+              <w:top w:val="single" w:color="BBBBBB" w:sz="1"/>
+              <w:left w:val="single" w:color="BBBBBB" w:sz="1"/>
+              <w:bottom w:val="single" w:color="BBBBBB" w:sz="1"/>
+              <w:right w:val="single" w:color="BBBBBB" w:sz="1"/>
+            </w:tcBorders>
+            <w:tcMar>
+              <w:top w:type="dxa" w:w="60"/>
+              <w:left w:type="dxa" w:w="100"/>
+              <w:bottom w:type="dxa" w:w="60"/>
+              <w:right w:type="dxa" w:w="100"/>
+            </w:tcMar>
+          </w:tcPr>
+          <w:p>
+            <w:r>
+              <w:rPr>
+                <w:b w:val="false"/>
+                <w:bCs w:val="false"/>
+                <w:sz w:val="20"/>
+                <w:szCs w:val="20"/>
+              </w:rPr>
+              <w:t xml:space="preserve">US1.13</w:t>
+            </w:r>
+          </w:p>
+        </w:tc>
+      </w:tr>
+      <w:tr>
+        <w:trPr>
+          <w:tblHeader w:val="off"/>
+        </w:trPr>
+        <w:tc>
+          <w:tcPr>
+            <w:tcW w:type="dxa" w:w="900"/>
+            <w:tcBorders>
+              <w:top w:val="single" w:color="BBBBBB" w:sz="1"/>
+              <w:left w:val="single" w:color="BBBBBB" w:sz="1"/>
+              <w:bottom w:val="single" w:color="BBBBBB" w:sz="1"/>
+              <w:right w:val="single" w:color="BBBBBB" w:sz="1"/>
+            </w:tcBorders>
+            <w:tcMar>
+              <w:top w:type="dxa" w:w="60"/>
+              <w:left w:type="dxa" w:w="100"/>
+              <w:bottom w:type="dxa" w:w="60"/>
+              <w:right w:type="dxa" w:w="100"/>
+            </w:tcMar>
+          </w:tcPr>
+          <w:p>
+            <w:r>
+              <w:rPr>
+                <w:b w:val="false"/>
+                <w:bCs w:val="false"/>
+                <w:sz w:val="20"/>
+                <w:szCs w:val="20"/>
+              </w:rPr>
+              <w:t xml:space="preserve">FR01.24</w:t>
+            </w:r>
+          </w:p>
+        </w:tc>
+        <w:tc>
+          <w:tcPr>
+            <w:tcW w:type="dxa" w:w="5460"/>
+            <w:tcBorders>
+              <w:top w:val="single" w:color="BBBBBB" w:sz="1"/>
+              <w:left w:val="single" w:color="BBBBBB" w:sz="1"/>
+              <w:bottom w:val="single" w:color="BBBBBB" w:sz="1"/>
+              <w:right w:val="single" w:color="BBBBBB" w:sz="1"/>
+            </w:tcBorders>
+            <w:tcMar>
+              <w:top w:type="dxa" w:w="60"/>
+              <w:left w:type="dxa" w:w="100"/>
+              <w:bottom w:type="dxa" w:w="60"/>
+              <w:right w:type="dxa" w:w="100"/>
+            </w:tcMar>
+          </w:tcPr>
+          <w:p>
+            <w:r>
+              <w:rPr>
+                <w:b w:val="false"/>
+                <w:bCs w:val="false"/>
+                <w:sz w:val="20"/>
+                <w:szCs w:val="20"/>
+              </w:rPr>
+              <w:t xml:space="preserve">The system shall show the plan screen (headings, disclaimer, balance, checklist wording, cashier script) in English or Taglish with a toggle; the request letter stays in formal English.</w:t>
+            </w:r>
+          </w:p>
+        </w:tc>
+        <w:tc>
+          <w:tcPr>
+            <w:tcW w:type="dxa" w:w="1200"/>
+            <w:tcBorders>
+              <w:top w:val="single" w:color="BBBBBB" w:sz="1"/>
+              <w:left w:val="single" w:color="BBBBBB" w:sz="1"/>
+              <w:bottom w:val="single" w:color="BBBBBB" w:sz="1"/>
+              <w:right w:val="single" w:color="BBBBBB" w:sz="1"/>
+            </w:tcBorders>
+            <w:tcMar>
+              <w:top w:type="dxa" w:w="60"/>
+              <w:left w:type="dxa" w:w="100"/>
+              <w:bottom w:type="dxa" w:w="60"/>
+              <w:right w:type="dxa" w:w="100"/>
+            </w:tcMar>
+          </w:tcPr>
+          <w:p>
+            <w:r>
+              <w:rPr>
+                <w:b w:val="false"/>
+                <w:bCs w:val="false"/>
+                <w:sz w:val="20"/>
+                <w:szCs w:val="20"/>
+              </w:rPr>
+              <w:t xml:space="preserve">S</w:t>
+            </w:r>
+          </w:p>
+        </w:tc>
+        <w:tc>
+          <w:tcPr>
+            <w:tcW w:type="dxa" w:w="1800"/>
+            <w:tcBorders>
+              <w:top w:val="single" w:color="BBBBBB" w:sz="1"/>
+              <w:left w:val="single" w:color="BBBBBB" w:sz="1"/>
+              <w:bottom w:val="single" w:color="BBBBBB" w:sz="1"/>
+              <w:right w:val="single" w:color="BBBBBB" w:sz="1"/>
+            </w:tcBorders>
+            <w:tcMar>
+              <w:top w:type="dxa" w:w="60"/>
+              <w:left w:type="dxa" w:w="100"/>
+              <w:bottom w:type="dxa" w:w="60"/>
+              <w:right w:type="dxa" w:w="100"/>
+            </w:tcMar>
+          </w:tcPr>
+          <w:p>
+            <w:r>
+              <w:rPr>
+                <w:b w:val="false"/>
+                <w:bCs w:val="false"/>
+                <w:sz w:val="20"/>
+                <w:szCs w:val="20"/>
+              </w:rPr>
+              <w:t xml:space="preserve">US1.2</w:t>
+            </w:r>
+          </w:p>
+        </w:tc>
+      </w:tr>
+      <w:tr>
+        <w:trPr>
+          <w:tblHeader w:val="off"/>
+        </w:trPr>
+        <w:tc>
+          <w:tcPr>
+            <w:tcW w:type="dxa" w:w="900"/>
+            <w:tcBorders>
+              <w:top w:val="single" w:color="BBBBBB" w:sz="1"/>
+              <w:left w:val="single" w:color="BBBBBB" w:sz="1"/>
+              <w:bottom w:val="single" w:color="BBBBBB" w:sz="1"/>
+              <w:right w:val="single" w:color="BBBBBB" w:sz="1"/>
+            </w:tcBorders>
+            <w:tcMar>
+              <w:top w:type="dxa" w:w="60"/>
+              <w:left w:type="dxa" w:w="100"/>
+              <w:bottom w:type="dxa" w:w="60"/>
+              <w:right w:type="dxa" w:w="100"/>
+            </w:tcMar>
+          </w:tcPr>
+          <w:p>
+            <w:r>
+              <w:rPr>
+                <w:b w:val="false"/>
+                <w:bCs w:val="false"/>
+                <w:sz w:val="20"/>
+                <w:szCs w:val="20"/>
+              </w:rPr>
+              <w:t xml:space="preserve">FR01.25</w:t>
+            </w:r>
+          </w:p>
+        </w:tc>
+        <w:tc>
+          <w:tcPr>
+            <w:tcW w:type="dxa" w:w="5460"/>
+            <w:tcBorders>
+              <w:top w:val="single" w:color="BBBBBB" w:sz="1"/>
+              <w:left w:val="single" w:color="BBBBBB" w:sz="1"/>
+              <w:bottom w:val="single" w:color="BBBBBB" w:sz="1"/>
+              <w:right w:val="single" w:color="BBBBBB" w:sz="1"/>
+            </w:tcBorders>
+            <w:tcMar>
+              <w:top w:type="dxa" w:w="60"/>
+              <w:left w:type="dxa" w:w="100"/>
+              <w:bottom w:type="dxa" w:w="60"/>
+              <w:right w:type="dxa" w:w="100"/>
+            </w:tcMar>
+          </w:tcPr>
+          <w:p>
+            <w:r>
+              <w:rPr>
+                <w:b w:val="false"/>
+                <w:bCs w:val="false"/>
+                <w:sz w:val="20"/>
+                <w:szCs w:val="20"/>
+              </w:rPr>
+              <w:t xml:space="preserve">The system shall remember checklist ticks and the language choice in the browser only (localStorage) and shall work normally when storage is blocked.</w:t>
+            </w:r>
+          </w:p>
+        </w:tc>
+        <w:tc>
+          <w:tcPr>
+            <w:tcW w:type="dxa" w:w="1200"/>
+            <w:tcBorders>
+              <w:top w:val="single" w:color="BBBBBB" w:sz="1"/>
+              <w:left w:val="single" w:color="BBBBBB" w:sz="1"/>
+              <w:bottom w:val="single" w:color="BBBBBB" w:sz="1"/>
+              <w:right w:val="single" w:color="BBBBBB" w:sz="1"/>
+            </w:tcBorders>
+            <w:tcMar>
+              <w:top w:type="dxa" w:w="60"/>
+              <w:left w:type="dxa" w:w="100"/>
+              <w:bottom w:type="dxa" w:w="60"/>
+              <w:right w:type="dxa" w:w="100"/>
+            </w:tcMar>
+          </w:tcPr>
+          <w:p>
+            <w:r>
+              <w:rPr>
+                <w:b w:val="false"/>
+                <w:bCs w:val="false"/>
+                <w:sz w:val="20"/>
+                <w:szCs w:val="20"/>
+              </w:rPr>
+              <w:t xml:space="preserve">C</w:t>
+            </w:r>
+          </w:p>
+        </w:tc>
+        <w:tc>
+          <w:tcPr>
+            <w:tcW w:type="dxa" w:w="1800"/>
+            <w:tcBorders>
+              <w:top w:val="single" w:color="BBBBBB" w:sz="1"/>
+              <w:left w:val="single" w:color="BBBBBB" w:sz="1"/>
+              <w:bottom w:val="single" w:color="BBBBBB" w:sz="1"/>
+              <w:right w:val="single" w:color="BBBBBB" w:sz="1"/>
+            </w:tcBorders>
+            <w:tcMar>
+              <w:top w:type="dxa" w:w="60"/>
+              <w:left w:type="dxa" w:w="100"/>
+              <w:bottom w:type="dxa" w:w="60"/>
+              <w:right w:type="dxa" w:w="100"/>
+            </w:tcMar>
+          </w:tcPr>
+          <w:p>
+            <w:r>
+              <w:rPr>
+                <w:b w:val="false"/>
+                <w:bCs w:val="false"/>
+                <w:sz w:val="20"/>
+                <w:szCs w:val="20"/>
+              </w:rPr>
+              <w:t xml:space="preserve">US1.12</w:t>
+            </w:r>
+          </w:p>
+        </w:tc>
+      </w:tr>
+      <w:tr>
+        <w:trPr>
+          <w:tblHeader w:val="off"/>
+        </w:trPr>
+        <w:tc>
+          <w:tcPr>
+            <w:tcW w:type="dxa" w:w="900"/>
+            <w:tcBorders>
+              <w:top w:val="single" w:color="BBBBBB" w:sz="1"/>
+              <w:left w:val="single" w:color="BBBBBB" w:sz="1"/>
+              <w:bottom w:val="single" w:color="BBBBBB" w:sz="1"/>
+              <w:right w:val="single" w:color="BBBBBB" w:sz="1"/>
+            </w:tcBorders>
+            <w:tcMar>
+              <w:top w:type="dxa" w:w="60"/>
+              <w:left w:type="dxa" w:w="100"/>
+              <w:bottom w:type="dxa" w:w="60"/>
+              <w:right w:type="dxa" w:w="100"/>
+            </w:tcMar>
+          </w:tcPr>
+          <w:p>
+            <w:r>
+              <w:rPr>
+                <w:b w:val="false"/>
+                <w:bCs w:val="false"/>
+                <w:sz w:val="20"/>
+                <w:szCs w:val="20"/>
+              </w:rPr>
+              <w:t xml:space="preserve">FR01.26</w:t>
+            </w:r>
+          </w:p>
+        </w:tc>
+        <w:tc>
+          <w:tcPr>
+            <w:tcW w:type="dxa" w:w="5460"/>
+            <w:tcBorders>
+              <w:top w:val="single" w:color="BBBBBB" w:sz="1"/>
+              <w:left w:val="single" w:color="BBBBBB" w:sz="1"/>
+              <w:bottom w:val="single" w:color="BBBBBB" w:sz="1"/>
+              <w:right w:val="single" w:color="BBBBBB" w:sz="1"/>
+            </w:tcBorders>
+            <w:tcMar>
+              <w:top w:type="dxa" w:w="60"/>
+              <w:left w:type="dxa" w:w="100"/>
+              <w:bottom w:type="dxa" w:w="60"/>
+              <w:right w:type="dxa" w:w="100"/>
+            </w:tcMar>
+          </w:tcPr>
+          <w:p>
+            <w:r>
+              <w:rPr>
+                <w:b w:val="false"/>
+                <w:bCs w:val="false"/>
+                <w:sz w:val="20"/>
+                <w:szCs w:val="20"/>
+              </w:rPr>
+              <w:t xml:space="preserve">The system shall accept an optional amount already covered (HMO, or a PhilHealth amount the hospital quoted) and subtract it before the balance range is computed.</w:t>
+            </w:r>
+          </w:p>
+        </w:tc>
+        <w:tc>
+          <w:tcPr>
+            <w:tcW w:type="dxa" w:w="1200"/>
+            <w:tcBorders>
+              <w:top w:val="single" w:color="BBBBBB" w:sz="1"/>
+              <w:left w:val="single" w:color="BBBBBB" w:sz="1"/>
+              <w:bottom w:val="single" w:color="BBBBBB" w:sz="1"/>
+              <w:right w:val="single" w:color="BBBBBB" w:sz="1"/>
+            </w:tcBorders>
+            <w:tcMar>
+              <w:top w:type="dxa" w:w="60"/>
+              <w:left w:type="dxa" w:w="100"/>
+              <w:bottom w:type="dxa" w:w="60"/>
+              <w:right w:type="dxa" w:w="100"/>
+            </w:tcMar>
+          </w:tcPr>
+          <w:p>
+            <w:r>
+              <w:rPr>
+                <w:b w:val="false"/>
+                <w:bCs w:val="false"/>
+                <w:sz w:val="20"/>
+                <w:szCs w:val="20"/>
+              </w:rPr>
+              <w:t xml:space="preserve">S</w:t>
+            </w:r>
+          </w:p>
+        </w:tc>
+        <w:tc>
+          <w:tcPr>
+            <w:tcW w:type="dxa" w:w="1800"/>
+            <w:tcBorders>
+              <w:top w:val="single" w:color="BBBBBB" w:sz="1"/>
+              <w:left w:val="single" w:color="BBBBBB" w:sz="1"/>
+              <w:bottom w:val="single" w:color="BBBBBB" w:sz="1"/>
+              <w:right w:val="single" w:color="BBBBBB" w:sz="1"/>
+            </w:tcBorders>
+            <w:tcMar>
+              <w:top w:type="dxa" w:w="60"/>
+              <w:left w:type="dxa" w:w="100"/>
+              <w:bottom w:type="dxa" w:w="60"/>
+              <w:right w:type="dxa" w:w="100"/>
+            </w:tcMar>
+          </w:tcPr>
+          <w:p>
+            <w:r>
+              <w:rPr>
+                <w:b w:val="false"/>
+                <w:bCs w:val="false"/>
+                <w:sz w:val="20"/>
+                <w:szCs w:val="20"/>
+              </w:rPr>
+              <w:t xml:space="preserve">US1.4</w:t>
+            </w:r>
+          </w:p>
+        </w:tc>
+      </w:tr>
+      <w:tr>
+        <w:trPr>
+          <w:tblHeader w:val="off"/>
+        </w:trPr>
+        <w:tc>
+          <w:tcPr>
+            <w:tcW w:type="dxa" w:w="900"/>
+            <w:tcBorders>
+              <w:top w:val="single" w:color="BBBBBB" w:sz="1"/>
+              <w:left w:val="single" w:color="BBBBBB" w:sz="1"/>
+              <w:bottom w:val="single" w:color="BBBBBB" w:sz="1"/>
+              <w:right w:val="single" w:color="BBBBBB" w:sz="1"/>
+            </w:tcBorders>
+            <w:tcMar>
+              <w:top w:type="dxa" w:w="60"/>
+              <w:left w:type="dxa" w:w="100"/>
+              <w:bottom w:type="dxa" w:w="60"/>
+              <w:right w:type="dxa" w:w="100"/>
+            </w:tcMar>
+          </w:tcPr>
+          <w:p>
+            <w:r>
+              <w:rPr>
+                <w:b w:val="false"/>
+                <w:bCs w:val="false"/>
+                <w:sz w:val="20"/>
+                <w:szCs w:val="20"/>
+              </w:rPr>
               <w:t xml:space="preserve">FR01.19</w:t>
             </w:r>
           </w:p>
@@ -4880,7 +5671,7 @@
                 <w:sz w:val="20"/>
                 <w:szCs w:val="20"/>
               </w:rPr>
-              <w:t xml:space="preserve">The extraction endpoint shall respond within 15 seconds for 95% of single-page photos under normal network conditions.</w:t>
+              <w:t xml:space="preserve">The extraction endpoint, including category checks and hospital verification, shall respond within 25 seconds for 95% of single-page photos under normal network conditions (measured: web verification about 6 seconds, run in parallel).</w:t>
             </w:r>
           </w:p>
         </w:tc>
@@ -5147,7 +5938,7 @@
                 <w:sz w:val="20"/>
                 <w:szCs w:val="20"/>
               </w:rPr>
-              <w:t xml:space="preserve">The system shall not store uploaded bills or answers on the server after the request completes.</w:t>
+              <w:t xml:space="preserve">The system shall not store uploaded bills or answers on the server after the request completes. Only the hospital name, address and header text (no patient data) are used in the web-search verification.</w:t>
             </w:r>
           </w:p>
         </w:tc>
@@ -5691,7 +6482,7 @@
         </w:numPr>
       </w:pPr>
       <w:r>
-        <w:t xml:space="preserve">Five questions: hospital type, room type, PhilHealth, patient category, household situation.</w:t>
+        <w:t xml:space="preserve">Auto-filled answers: hospital type (checked two ways), room, admitted/outpatient, PhilHealth and category are filled from the bill with a note and a source link. The user only confirms them and answers what the bill cannot show: household income, dependents, and any other cover.</w:t>
       </w:r>
     </w:p>
     <w:p>
@@ -6178,7 +6969,7 @@
                 <w:sz w:val="20"/>
                 <w:szCs w:val="20"/>
               </w:rPr>
-              <w:t xml:space="preserve">GPT-6 Astra (escalation)</w:t>
+              <w:t xml:space="preserve">GPT-6.1 Sol with the web search tool</w:t>
             </w:r>
           </w:p>
         </w:tc>
@@ -6206,7 +6997,7 @@
                 <w:sz w:val="20"/>
                 <w:szCs w:val="20"/>
               </w:rPr>
-              <w:t xml:space="preserve">One retry when several fields are low confidence or lines do not sum to the total</w:t>
+              <w:t xml:space="preserve">Verifies who owns and runs the hospital (second check on hospital type) with max 3 tool calls</w:t>
             </w:r>
           </w:p>
         </w:tc>
@@ -6234,7 +7025,7 @@
                 <w:sz w:val="20"/>
                 <w:szCs w:val="20"/>
               </w:rPr>
-              <w:t xml:space="preserve">Best accuracy only where needed, protects the $50 budget</w:t>
+              <w:t xml:space="preserve">Independent evidence and a source link the user can open; tested live (Quezon City General Hospital returned LGU and Makati Medical Center returned private, each with its source)</w:t>
             </w:r>
           </w:p>
         </w:tc>
@@ -6267,7 +7058,7 @@
                 <w:sz w:val="20"/>
                 <w:szCs w:val="20"/>
               </w:rPr>
-              <w:t xml:space="preserve">store: false, output token caps</w:t>
+              <w:t xml:space="preserve">GPT-6 Astra (escalation)</w:t>
             </w:r>
           </w:p>
         </w:tc>
@@ -6295,7 +7086,7 @@
                 <w:sz w:val="20"/>
                 <w:szCs w:val="20"/>
               </w:rPr>
-              <w:t xml:space="preserve">Every OpenAI call</w:t>
+              <w:t xml:space="preserve">One retry when several fields are low confidence or lines do not sum to the total</w:t>
             </w:r>
           </w:p>
         </w:tc>
@@ -6323,7 +7114,7 @@
                 <w:sz w:val="20"/>
                 <w:szCs w:val="20"/>
               </w:rPr>
-              <w:t xml:space="preserve">Privacy (no stored bills) and cost control</w:t>
+              <w:t xml:space="preserve">Best accuracy only where needed, protects the $50 budget</w:t>
             </w:r>
           </w:p>
         </w:tc>
@@ -6356,7 +7147,7 @@
                 <w:sz w:val="20"/>
                 <w:szCs w:val="20"/>
               </w:rPr>
-              <w:t xml:space="preserve">Deterministic rules engine (not AI)</w:t>
+              <w:t xml:space="preserve">store: false, output token caps</w:t>
             </w:r>
           </w:p>
         </w:tc>
@@ -6384,7 +7175,7 @@
                 <w:sz w:val="20"/>
                 <w:szCs w:val="20"/>
               </w:rPr>
-              <w:t xml:space="preserve">Eligibility, balance range, checklist, letter</w:t>
+              <w:t xml:space="preserve">Every OpenAI call</w:t>
             </w:r>
           </w:p>
         </w:tc>
@@ -6412,7 +7203,7 @@
                 <w:sz w:val="20"/>
                 <w:szCs w:val="20"/>
               </w:rPr>
-              <w:t xml:space="preserve">Verifiable, source-cited results; AI reads and explains only</w:t>
+              <w:t xml:space="preserve">Privacy (no stored bills) and cost control</w:t>
             </w:r>
           </w:p>
         </w:tc>
@@ -6445,6 +7236,95 @@
                 <w:sz w:val="20"/>
                 <w:szCs w:val="20"/>
               </w:rPr>
+              <w:t xml:space="preserve">Deterministic rules engine (not AI)</w:t>
+            </w:r>
+          </w:p>
+        </w:tc>
+        <w:tc>
+          <w:tcPr>
+            <w:tcW w:type="dxa" w:w="3400"/>
+            <w:tcBorders>
+              <w:top w:val="single" w:color="BBBBBB" w:sz="1"/>
+              <w:left w:val="single" w:color="BBBBBB" w:sz="1"/>
+              <w:bottom w:val="single" w:color="BBBBBB" w:sz="1"/>
+              <w:right w:val="single" w:color="BBBBBB" w:sz="1"/>
+            </w:tcBorders>
+            <w:tcMar>
+              <w:top w:type="dxa" w:w="60"/>
+              <w:left w:type="dxa" w:w="100"/>
+              <w:bottom w:type="dxa" w:w="60"/>
+              <w:right w:type="dxa" w:w="100"/>
+            </w:tcMar>
+          </w:tcPr>
+          <w:p>
+            <w:r>
+              <w:rPr>
+                <w:b w:val="false"/>
+                <w:bCs w:val="false"/>
+                <w:sz w:val="20"/>
+                <w:szCs w:val="20"/>
+              </w:rPr>
+              <w:t xml:space="preserve">Eligibility, balance range, checklist, letter</w:t>
+            </w:r>
+          </w:p>
+        </w:tc>
+        <w:tc>
+          <w:tcPr>
+            <w:tcW w:type="dxa" w:w="3360"/>
+            <w:tcBorders>
+              <w:top w:val="single" w:color="BBBBBB" w:sz="1"/>
+              <w:left w:val="single" w:color="BBBBBB" w:sz="1"/>
+              <w:bottom w:val="single" w:color="BBBBBB" w:sz="1"/>
+              <w:right w:val="single" w:color="BBBBBB" w:sz="1"/>
+            </w:tcBorders>
+            <w:tcMar>
+              <w:top w:type="dxa" w:w="60"/>
+              <w:left w:type="dxa" w:w="100"/>
+              <w:bottom w:type="dxa" w:w="60"/>
+              <w:right w:type="dxa" w:w="100"/>
+            </w:tcMar>
+          </w:tcPr>
+          <w:p>
+            <w:r>
+              <w:rPr>
+                <w:b w:val="false"/>
+                <w:bCs w:val="false"/>
+                <w:sz w:val="20"/>
+                <w:szCs w:val="20"/>
+              </w:rPr>
+              <w:t xml:space="preserve">Verifiable, source-cited results; AI reads and explains only</w:t>
+            </w:r>
+          </w:p>
+        </w:tc>
+      </w:tr>
+      <w:tr>
+        <w:trPr>
+          <w:tblHeader w:val="off"/>
+        </w:trPr>
+        <w:tc>
+          <w:tcPr>
+            <w:tcW w:type="dxa" w:w="2600"/>
+            <w:tcBorders>
+              <w:top w:val="single" w:color="BBBBBB" w:sz="1"/>
+              <w:left w:val="single" w:color="BBBBBB" w:sz="1"/>
+              <w:bottom w:val="single" w:color="BBBBBB" w:sz="1"/>
+              <w:right w:val="single" w:color="BBBBBB" w:sz="1"/>
+            </w:tcBorders>
+            <w:tcMar>
+              <w:top w:type="dxa" w:w="60"/>
+              <w:left w:type="dxa" w:w="100"/>
+              <w:bottom w:type="dxa" w:w="60"/>
+              <w:right w:type="dxa" w:w="100"/>
+            </w:tcMar>
+          </w:tcPr>
+          <w:p>
+            <w:r>
+              <w:rPr>
+                <w:b w:val="false"/>
+                <w:bCs w:val="false"/>
+                <w:sz w:val="20"/>
+                <w:szCs w:val="20"/>
+              </w:rPr>
               <w:t xml:space="preserve">Decisions API (public beta since 6 Oct 2026) with GPT-6 Luna</w:t>
             </w:r>
           </w:p>
@@ -6473,7 +7353,7 @@
                 <w:sz w:val="20"/>
                 <w:szCs w:val="20"/>
               </w:rPr>
-              <w:t xml:space="preserve">Second-opinion category for every bill line (room, medicine, lab, doctor's fee, supplies, deduction, other) with confidence, right after extraction</w:t>
+              <w:t xml:space="preserve">Second-opinion category for every bill line, and first check of the hospital type (room, medicine, lab, doctor's fee, supplies, deduction, other) with confidence, right after extraction</w:t>
             </w:r>
           </w:p>
         </w:tc>
@@ -7166,6 +8046,95 @@
                 <w:szCs w:val="20"/>
               </w:rPr>
               <w:t xml:space="preserve">Used only to classify bill lines. Eligibility stays in own deterministic code; the extraction stands if the call fails.</w:t>
+            </w:r>
+          </w:p>
+        </w:tc>
+      </w:tr>
+      <w:tr>
+        <w:trPr>
+          <w:tblHeader w:val="off"/>
+        </w:trPr>
+        <w:tc>
+          <w:tcPr>
+            <w:tcW w:type="dxa" w:w="700"/>
+            <w:tcBorders>
+              <w:top w:val="single" w:color="BBBBBB" w:sz="1"/>
+              <w:left w:val="single" w:color="BBBBBB" w:sz="1"/>
+              <w:bottom w:val="single" w:color="BBBBBB" w:sz="1"/>
+              <w:right w:val="single" w:color="BBBBBB" w:sz="1"/>
+            </w:tcBorders>
+            <w:tcMar>
+              <w:top w:type="dxa" w:w="60"/>
+              <w:left w:type="dxa" w:w="100"/>
+              <w:bottom w:type="dxa" w:w="60"/>
+              <w:right w:type="dxa" w:w="100"/>
+            </w:tcMar>
+          </w:tcPr>
+          <w:p>
+            <w:r>
+              <w:rPr>
+                <w:b w:val="false"/>
+                <w:bCs w:val="false"/>
+                <w:sz w:val="20"/>
+                <w:szCs w:val="20"/>
+              </w:rPr>
+              <w:t xml:space="preserve">3c</w:t>
+            </w:r>
+          </w:p>
+        </w:tc>
+        <w:tc>
+          <w:tcPr>
+            <w:tcW w:type="dxa" w:w="5000"/>
+            <w:tcBorders>
+              <w:top w:val="single" w:color="BBBBBB" w:sz="1"/>
+              <w:left w:val="single" w:color="BBBBBB" w:sz="1"/>
+              <w:bottom w:val="single" w:color="BBBBBB" w:sz="1"/>
+              <w:right w:val="single" w:color="BBBBBB" w:sz="1"/>
+            </w:tcBorders>
+            <w:tcMar>
+              <w:top w:type="dxa" w:w="60"/>
+              <w:left w:type="dxa" w:w="100"/>
+              <w:bottom w:type="dxa" w:w="60"/>
+              <w:right w:type="dxa" w:w="100"/>
+            </w:tcMar>
+          </w:tcPr>
+          <w:p>
+            <w:r>
+              <w:rPr>
+                <w:b w:val="false"/>
+                <w:bCs w:val="false"/>
+                <w:sz w:val="20"/>
+                <w:szCs w:val="20"/>
+              </w:rPr>
+              <w:t xml:space="preserve">Auto-detected hospital type may be wrong (for example PGH is run by UP but funded by DOH), which changes whether ZBB is shown.</w:t>
+            </w:r>
+          </w:p>
+        </w:tc>
+        <w:tc>
+          <w:tcPr>
+            <w:tcW w:type="dxa" w:w="3660"/>
+            <w:tcBorders>
+              <w:top w:val="single" w:color="BBBBBB" w:sz="1"/>
+              <w:left w:val="single" w:color="BBBBBB" w:sz="1"/>
+              <w:bottom w:val="single" w:color="BBBBBB" w:sz="1"/>
+              <w:right w:val="single" w:color="BBBBBB" w:sz="1"/>
+            </w:tcBorders>
+            <w:tcMar>
+              <w:top w:type="dxa" w:w="60"/>
+              <w:left w:type="dxa" w:w="100"/>
+              <w:bottom w:type="dxa" w:w="60"/>
+              <w:right w:type="dxa" w:w="100"/>
+            </w:tcMar>
+          </w:tcPr>
+          <w:p>
+            <w:r>
+              <w:rPr>
+                <w:b w:val="false"/>
+                <w:bCs w:val="false"/>
+                <w:sz w:val="20"/>
+                <w:szCs w:val="20"/>
+              </w:rPr>
+              <w:t xml:space="preserve">Two independent checks, a visible evidence line and source link, a Please double-check warning when they disagree, and the answer is always editable.</w:t>
             </w:r>
           </w:p>
         </w:tc>

</xml_diff>

<commit_message>
Backend follows PRD: rules tests, rate limits, escalation flag, PRD corrections
</commit_message>
<xml_diff>
--- a/PRD - Hospital Bill Navigator.docx
+++ b/PRD - Hospital Bill Navigator.docx
@@ -4383,7 +4383,7 @@
                 <w:sz w:val="20"/>
                 <w:szCs w:val="20"/>
               </w:rPr>
-              <w:t xml:space="preserve">The system shall call OpenAI with store set to false, resize photos to at most 2200 px before upload, cap output tokens per call, and make no more than one escalation retry per bill.</w:t>
+              <w:t xml:space="preserve">The system shall call the OpenAI Responses API with store set to false, resize photos to at most 2200 px (down to 1400 px if needed to stay under the 4.5 MB request limit) before upload, cap output tokens per call, and make no more than one escalation retry per bill, keeping the first read if the retry is not better. The Decisions API has no store parameter, so it receives only line descriptions and hospital name, address and header text, never patient names.</w:t>
             </w:r>
           </w:p>
         </w:tc>
@@ -6116,7 +6116,7 @@
                 <w:sz w:val="20"/>
                 <w:szCs w:val="20"/>
               </w:rPr>
-              <w:t xml:space="preserve">The rules engine shall be pure functions covered by unit tests so that identical inputs always give identical outputs.</w:t>
+              <w:t xml:space="preserve">The rules engine shall be pure functions covered by automated unit tests (22 tests: ZBB conditions, balance math, discounts, bill flags, source fields, detection, escalation trigger) so that identical inputs always give identical outputs.</w:t>
             </w:r>
           </w:p>
         </w:tc>
@@ -6323,6 +6323,95 @@
                 <w:szCs w:val="20"/>
               </w:rPr>
               <w:t xml:space="preserve">M</w:t>
+            </w:r>
+          </w:p>
+        </w:tc>
+      </w:tr>
+      <w:tr>
+        <w:trPr>
+          <w:tblHeader w:val="off"/>
+        </w:trPr>
+        <w:tc>
+          <w:tcPr>
+            <w:tcW w:type="dxa" w:w="900"/>
+            <w:tcBorders>
+              <w:top w:val="single" w:color="BBBBBB" w:sz="1"/>
+              <w:left w:val="single" w:color="BBBBBB" w:sz="1"/>
+              <w:bottom w:val="single" w:color="BBBBBB" w:sz="1"/>
+              <w:right w:val="single" w:color="BBBBBB" w:sz="1"/>
+            </w:tcBorders>
+            <w:tcMar>
+              <w:top w:type="dxa" w:w="60"/>
+              <w:left w:type="dxa" w:w="100"/>
+              <w:bottom w:type="dxa" w:w="60"/>
+              <w:right w:type="dxa" w:w="100"/>
+            </w:tcMar>
+          </w:tcPr>
+          <w:p>
+            <w:r>
+              <w:rPr>
+                <w:b w:val="false"/>
+                <w:bCs w:val="false"/>
+                <w:sz w:val="20"/>
+                <w:szCs w:val="20"/>
+              </w:rPr>
+              <w:t xml:space="preserve">NF10</w:t>
+            </w:r>
+          </w:p>
+        </w:tc>
+        <w:tc>
+          <w:tcPr>
+            <w:tcW w:type="dxa" w:w="7000"/>
+            <w:tcBorders>
+              <w:top w:val="single" w:color="BBBBBB" w:sz="1"/>
+              <w:left w:val="single" w:color="BBBBBB" w:sz="1"/>
+              <w:bottom w:val="single" w:color="BBBBBB" w:sz="1"/>
+              <w:right w:val="single" w:color="BBBBBB" w:sz="1"/>
+            </w:tcBorders>
+            <w:tcMar>
+              <w:top w:type="dxa" w:w="60"/>
+              <w:left w:type="dxa" w:w="100"/>
+              <w:bottom w:type="dxa" w:w="60"/>
+              <w:right w:type="dxa" w:w="100"/>
+            </w:tcMar>
+          </w:tcPr>
+          <w:p>
+            <w:r>
+              <w:rPr>
+                <w:b w:val="false"/>
+                <w:bCs w:val="false"/>
+                <w:sz w:val="20"/>
+                <w:szCs w:val="20"/>
+              </w:rPr>
+              <w:t xml:space="preserve">The API routes shall limit each client IP to 6 photo reads per minute and 40 per hour, and 10 explanation calls per minute and 80 per hour, returning HTTP 429 beyond that. Best effort only: counters are in memory per server instance.</w:t>
+            </w:r>
+          </w:p>
+        </w:tc>
+        <w:tc>
+          <w:tcPr>
+            <w:tcW w:type="dxa" w:w="1460"/>
+            <w:tcBorders>
+              <w:top w:val="single" w:color="BBBBBB" w:sz="1"/>
+              <w:left w:val="single" w:color="BBBBBB" w:sz="1"/>
+              <w:bottom w:val="single" w:color="BBBBBB" w:sz="1"/>
+              <w:right w:val="single" w:color="BBBBBB" w:sz="1"/>
+            </w:tcBorders>
+            <w:tcMar>
+              <w:top w:type="dxa" w:w="60"/>
+              <w:left w:type="dxa" w:w="100"/>
+              <w:bottom w:type="dxa" w:w="60"/>
+              <w:right w:type="dxa" w:w="100"/>
+            </w:tcMar>
+          </w:tcPr>
+          <w:p>
+            <w:r>
+              <w:rPr>
+                <w:b w:val="false"/>
+                <w:bCs w:val="false"/>
+                <w:sz w:val="20"/>
+                <w:szCs w:val="20"/>
+              </w:rPr>
+              <w:t xml:space="preserve">S</w:t>
             </w:r>
           </w:p>
         </w:tc>

</xml_diff>

<commit_message>
Balance scenarios, on-screen limitations section, letter uses no-aid amount; PRD updated
</commit_message>
<xml_diff>
--- a/PRD - Hospital Bill Navigator.docx
+++ b/PRD - Hospital Bill Navigator.docx
@@ -5408,6 +5408,240 @@
                 <w:sz w:val="20"/>
                 <w:szCs w:val="20"/>
               </w:rPr>
+              <w:t xml:space="preserve">FR01.27</w:t>
+            </w:r>
+          </w:p>
+        </w:tc>
+        <w:tc>
+          <w:tcPr>
+            <w:tcW w:type="dxa" w:w="5460"/>
+            <w:tcBorders>
+              <w:top w:val="single" w:color="BBBBBB" w:sz="1"/>
+              <w:left w:val="single" w:color="BBBBBB" w:sz="1"/>
+              <w:bottom w:val="single" w:color="BBBBBB" w:sz="1"/>
+              <w:right w:val="single" w:color="BBBBBB" w:sz="1"/>
+            </w:tcBorders>
+            <w:tcMar>
+              <w:top w:type="dxa" w:w="60"/>
+              <w:left w:type="dxa" w:w="100"/>
+              <w:bottom w:type="dxa" w:w="60"/>
+              <w:right w:type="dxa" w:w="100"/>
+            </w:tcMar>
+          </w:tcPr>
+          <w:p>
+            <w:r>
+              <w:rPr>
+                <w:b w:val="false"/>
+                <w:bCs w:val="false"/>
+                <w:sz w:val="20"/>
+                <w:szCs w:val="20"/>
+              </w:rPr>
+              <w:t xml:space="preserve">The system shall present the balance as up to three labelled scenarios (if zero balance billing covers the stay; if no aid is approved; if DSWD and DOH aid cover the most they can, capped at PHP 75,000), each with what decides it and who to ask, in English and Taglish, instead of one wide range.</w:t>
+            </w:r>
+          </w:p>
+        </w:tc>
+        <w:tc>
+          <w:tcPr>
+            <w:tcW w:type="dxa" w:w="1200"/>
+            <w:tcBorders>
+              <w:top w:val="single" w:color="BBBBBB" w:sz="1"/>
+              <w:left w:val="single" w:color="BBBBBB" w:sz="1"/>
+              <w:bottom w:val="single" w:color="BBBBBB" w:sz="1"/>
+              <w:right w:val="single" w:color="BBBBBB" w:sz="1"/>
+            </w:tcBorders>
+            <w:tcMar>
+              <w:top w:type="dxa" w:w="60"/>
+              <w:left w:type="dxa" w:w="100"/>
+              <w:bottom w:type="dxa" w:w="60"/>
+              <w:right w:type="dxa" w:w="100"/>
+            </w:tcMar>
+          </w:tcPr>
+          <w:p>
+            <w:r>
+              <w:rPr>
+                <w:b w:val="false"/>
+                <w:bCs w:val="false"/>
+                <w:sz w:val="20"/>
+                <w:szCs w:val="20"/>
+              </w:rPr>
+              <w:t xml:space="preserve">M</w:t>
+            </w:r>
+          </w:p>
+        </w:tc>
+        <w:tc>
+          <w:tcPr>
+            <w:tcW w:type="dxa" w:w="1800"/>
+            <w:tcBorders>
+              <w:top w:val="single" w:color="BBBBBB" w:sz="1"/>
+              <w:left w:val="single" w:color="BBBBBB" w:sz="1"/>
+              <w:bottom w:val="single" w:color="BBBBBB" w:sz="1"/>
+              <w:right w:val="single" w:color="BBBBBB" w:sz="1"/>
+            </w:tcBorders>
+            <w:tcMar>
+              <w:top w:type="dxa" w:w="60"/>
+              <w:left w:type="dxa" w:w="100"/>
+              <w:bottom w:type="dxa" w:w="60"/>
+              <w:right w:type="dxa" w:w="100"/>
+            </w:tcMar>
+          </w:tcPr>
+          <w:p>
+            <w:r>
+              <w:rPr>
+                <w:b w:val="false"/>
+                <w:bCs w:val="false"/>
+                <w:sz w:val="20"/>
+                <w:szCs w:val="20"/>
+              </w:rPr>
+              <w:t xml:space="preserve">US1.4</w:t>
+            </w:r>
+          </w:p>
+        </w:tc>
+      </w:tr>
+      <w:tr>
+        <w:trPr>
+          <w:tblHeader w:val="off"/>
+        </w:trPr>
+        <w:tc>
+          <w:tcPr>
+            <w:tcW w:type="dxa" w:w="900"/>
+            <w:tcBorders>
+              <w:top w:val="single" w:color="BBBBBB" w:sz="1"/>
+              <w:left w:val="single" w:color="BBBBBB" w:sz="1"/>
+              <w:bottom w:val="single" w:color="BBBBBB" w:sz="1"/>
+              <w:right w:val="single" w:color="BBBBBB" w:sz="1"/>
+            </w:tcBorders>
+            <w:tcMar>
+              <w:top w:type="dxa" w:w="60"/>
+              <w:left w:type="dxa" w:w="100"/>
+              <w:bottom w:type="dxa" w:w="60"/>
+              <w:right w:type="dxa" w:w="100"/>
+            </w:tcMar>
+          </w:tcPr>
+          <w:p>
+            <w:r>
+              <w:rPr>
+                <w:b w:val="false"/>
+                <w:bCs w:val="false"/>
+                <w:sz w:val="20"/>
+                <w:szCs w:val="20"/>
+              </w:rPr>
+              <w:t xml:space="preserve">FR01.28</w:t>
+            </w:r>
+          </w:p>
+        </w:tc>
+        <w:tc>
+          <w:tcPr>
+            <w:tcW w:type="dxa" w:w="5460"/>
+            <w:tcBorders>
+              <w:top w:val="single" w:color="BBBBBB" w:sz="1"/>
+              <w:left w:val="single" w:color="BBBBBB" w:sz="1"/>
+              <w:bottom w:val="single" w:color="BBBBBB" w:sz="1"/>
+              <w:right w:val="single" w:color="BBBBBB" w:sz="1"/>
+            </w:tcBorders>
+            <w:tcMar>
+              <w:top w:type="dxa" w:w="60"/>
+              <w:left w:type="dxa" w:w="100"/>
+              <w:bottom w:type="dxa" w:w="60"/>
+              <w:right w:type="dxa" w:w="100"/>
+            </w:tcMar>
+          </w:tcPr>
+          <w:p>
+            <w:r>
+              <w:rPr>
+                <w:b w:val="false"/>
+                <w:bCs w:val="false"/>
+                <w:sz w:val="20"/>
+                <w:szCs w:val="20"/>
+              </w:rPr>
+              <w:t xml:space="preserve">The system shall show an on-screen and printable limitations section listing what is unverified (full text of DO 2026-0443 and AO 2026-0031, income and non-member rules, PCSO doctor's fees, PhilHealth refund route, aid not additive, AI misreads), in English and Taglish.</w:t>
+            </w:r>
+          </w:p>
+        </w:tc>
+        <w:tc>
+          <w:tcPr>
+            <w:tcW w:type="dxa" w:w="1200"/>
+            <w:tcBorders>
+              <w:top w:val="single" w:color="BBBBBB" w:sz="1"/>
+              <w:left w:val="single" w:color="BBBBBB" w:sz="1"/>
+              <w:bottom w:val="single" w:color="BBBBBB" w:sz="1"/>
+              <w:right w:val="single" w:color="BBBBBB" w:sz="1"/>
+            </w:tcBorders>
+            <w:tcMar>
+              <w:top w:type="dxa" w:w="60"/>
+              <w:left w:type="dxa" w:w="100"/>
+              <w:bottom w:type="dxa" w:w="60"/>
+              <w:right w:type="dxa" w:w="100"/>
+            </w:tcMar>
+          </w:tcPr>
+          <w:p>
+            <w:r>
+              <w:rPr>
+                <w:b w:val="false"/>
+                <w:bCs w:val="false"/>
+                <w:sz w:val="20"/>
+                <w:szCs w:val="20"/>
+              </w:rPr>
+              <w:t xml:space="preserve">M</w:t>
+            </w:r>
+          </w:p>
+        </w:tc>
+        <w:tc>
+          <w:tcPr>
+            <w:tcW w:type="dxa" w:w="1800"/>
+            <w:tcBorders>
+              <w:top w:val="single" w:color="BBBBBB" w:sz="1"/>
+              <w:left w:val="single" w:color="BBBBBB" w:sz="1"/>
+              <w:bottom w:val="single" w:color="BBBBBB" w:sz="1"/>
+              <w:right w:val="single" w:color="BBBBBB" w:sz="1"/>
+            </w:tcBorders>
+            <w:tcMar>
+              <w:top w:type="dxa" w:w="60"/>
+              <w:left w:type="dxa" w:w="100"/>
+              <w:bottom w:type="dxa" w:w="60"/>
+              <w:right w:type="dxa" w:w="100"/>
+            </w:tcMar>
+          </w:tcPr>
+          <w:p>
+            <w:r>
+              <w:rPr>
+                <w:b w:val="false"/>
+                <w:bCs w:val="false"/>
+                <w:sz w:val="20"/>
+                <w:szCs w:val="20"/>
+              </w:rPr>
+              <w:t xml:space="preserve">US1.8</w:t>
+            </w:r>
+          </w:p>
+        </w:tc>
+      </w:tr>
+      <w:tr>
+        <w:trPr>
+          <w:tblHeader w:val="off"/>
+        </w:trPr>
+        <w:tc>
+          <w:tcPr>
+            <w:tcW w:type="dxa" w:w="900"/>
+            <w:tcBorders>
+              <w:top w:val="single" w:color="BBBBBB" w:sz="1"/>
+              <w:left w:val="single" w:color="BBBBBB" w:sz="1"/>
+              <w:bottom w:val="single" w:color="BBBBBB" w:sz="1"/>
+              <w:right w:val="single" w:color="BBBBBB" w:sz="1"/>
+            </w:tcBorders>
+            <w:tcMar>
+              <w:top w:type="dxa" w:w="60"/>
+              <w:left w:type="dxa" w:w="100"/>
+              <w:bottom w:type="dxa" w:w="60"/>
+              <w:right w:type="dxa" w:w="100"/>
+            </w:tcMar>
+          </w:tcPr>
+          <w:p>
+            <w:r>
+              <w:rPr>
+                <w:b w:val="false"/>
+                <w:bCs w:val="false"/>
+                <w:sz w:val="20"/>
+                <w:szCs w:val="20"/>
+              </w:rPr>
               <w:t xml:space="preserve">FR01.19</w:t>
             </w:r>
           </w:p>
@@ -6116,7 +6350,7 @@
                 <w:sz w:val="20"/>
                 <w:szCs w:val="20"/>
               </w:rPr>
-              <w:t xml:space="preserve">The rules engine shall be pure functions covered by automated unit tests (22 tests: ZBB conditions, balance math, discounts, bill flags, source fields, detection, escalation trigger) so that identical inputs always give identical outputs.</w:t>
+              <w:t xml:space="preserve">The rules engine shall be pure functions covered by automated unit tests (26 tests: ZBB conditions, balance math, scenarios, discounts, bill flags, source fields, detection, escalation trigger) so that identical inputs always give identical outputs.</w:t>
             </w:r>
           </w:p>
         </w:tc>
@@ -6595,7 +6829,7 @@
         </w:numPr>
       </w:pPr>
       <w:r>
-        <w:t xml:space="preserve">Result: waterfall from bill to remaining balance, with a 'why this result' trace and source for each program.</w:t>
+        <w:t xml:space="preserve">Result: up to three balance scenarios with what decides each, a waterfall from bill to balance, and a 'why this result' trace and source for each program.</w:t>
       </w:r>
     </w:p>
     <w:p>
@@ -6631,7 +6865,7 @@
         </w:numPr>
       </w:pPr>
       <w:r>
-        <w:t xml:space="preserve">Limitations screen: states rules are unverified estimates and to confirm with the billing office or PhilHealth.</w:t>
+        <w:t xml:space="preserve">Limitations section: states what is unverified and to confirm with the billing office or PhilHealth. Printed with the plan.</w:t>
       </w:r>
     </w:p>
     <w:p>

</xml_diff>